<commit_message>
add video demonstration, update doc
</commit_message>
<xml_diff>
--- a/Сопроводительная записка.docx
+++ b/Сопроводительная записка.docx
@@ -610,7 +610,7 @@
           <w:r>
             <w:fldChar w:fldCharType="separate"/>
           </w:r>
-          <w:hyperlink w:anchor="_Toc223504484" w:history="1">
+          <w:hyperlink w:anchor="_Toc223604023" w:history="1">
             <w:r>
               <w:rPr>
                 <w:rStyle w:val="ab"/>
@@ -637,7 +637,7 @@
                 <w:noProof/>
                 <w:webHidden/>
               </w:rPr>
-              <w:instrText xml:space="preserve"> PAGEREF _Toc223504484 \h </w:instrText>
+              <w:instrText xml:space="preserve"> PAGEREF _Toc223604023 \h </w:instrText>
             </w:r>
             <w:r>
               <w:rPr>
@@ -681,7 +681,7 @@
               <w14:ligatures w14:val="standardContextual"/>
             </w:rPr>
           </w:pPr>
-          <w:hyperlink w:anchor="_Toc223504485" w:history="1">
+          <w:hyperlink w:anchor="_Toc223604024" w:history="1">
             <w:r>
               <w:rPr>
                 <w:rStyle w:val="ab"/>
@@ -727,7 +727,7 @@
                 <w:noProof/>
                 <w:webHidden/>
               </w:rPr>
-              <w:instrText xml:space="preserve"> PAGEREF _Toc223504485 \h </w:instrText>
+              <w:instrText xml:space="preserve"> PAGEREF _Toc223604024 \h </w:instrText>
             </w:r>
             <w:r>
               <w:rPr>
@@ -764,7 +764,6 @@
             <w:tabs>
               <w:tab w:val="right" w:leader="dot" w:pos="9345"/>
             </w:tabs>
-            <w:ind w:left="284" w:hanging="284"/>
             <w:rPr>
               <w:rFonts w:asciiTheme="minorHAnsi" w:eastAsiaTheme="minorEastAsia" w:hAnsiTheme="minorHAnsi"/>
               <w:noProof/>
@@ -775,7 +774,7 @@
               <w14:ligatures w14:val="standardContextual"/>
             </w:rPr>
           </w:pPr>
-          <w:hyperlink w:anchor="_Toc223504486" w:history="1">
+          <w:hyperlink w:anchor="_Toc223604025" w:history="1">
             <w:r>
               <w:rPr>
                 <w:rStyle w:val="ab"/>
@@ -803,7 +802,7 @@
                 <w:noProof/>
                 <w:webHidden/>
               </w:rPr>
-              <w:instrText xml:space="preserve"> PAGEREF _Toc223504486 \h </w:instrText>
+              <w:instrText xml:space="preserve"> PAGEREF _Toc223604025 \h </w:instrText>
             </w:r>
             <w:r>
               <w:rPr>
@@ -840,7 +839,6 @@
             <w:tabs>
               <w:tab w:val="right" w:leader="dot" w:pos="9345"/>
             </w:tabs>
-            <w:ind w:left="284" w:hanging="284"/>
             <w:rPr>
               <w:rFonts w:asciiTheme="minorHAnsi" w:eastAsiaTheme="minorEastAsia" w:hAnsiTheme="minorHAnsi"/>
               <w:noProof/>
@@ -851,7 +849,7 @@
               <w14:ligatures w14:val="standardContextual"/>
             </w:rPr>
           </w:pPr>
-          <w:hyperlink w:anchor="_Toc223504487" w:history="1">
+          <w:hyperlink w:anchor="_Toc223604026" w:history="1">
             <w:r>
               <w:rPr>
                 <w:rStyle w:val="ab"/>
@@ -886,7 +884,7 @@
                 <w:noProof/>
                 <w:webHidden/>
               </w:rPr>
-              <w:instrText xml:space="preserve"> PAGEREF _Toc223504487 \h </w:instrText>
+              <w:instrText xml:space="preserve"> PAGEREF _Toc223604026 \h </w:instrText>
             </w:r>
             <w:r>
               <w:rPr>
@@ -923,7 +921,6 @@
             <w:tabs>
               <w:tab w:val="right" w:leader="dot" w:pos="9345"/>
             </w:tabs>
-            <w:ind w:left="284" w:hanging="284"/>
             <w:rPr>
               <w:rFonts w:asciiTheme="minorHAnsi" w:eastAsiaTheme="minorEastAsia" w:hAnsiTheme="minorHAnsi"/>
               <w:noProof/>
@@ -934,7 +931,7 @@
               <w14:ligatures w14:val="standardContextual"/>
             </w:rPr>
           </w:pPr>
-          <w:hyperlink w:anchor="_Toc223504488" w:history="1">
+          <w:hyperlink w:anchor="_Toc223604027" w:history="1">
             <w:r>
               <w:rPr>
                 <w:rStyle w:val="ab"/>
@@ -962,7 +959,7 @@
                 <w:noProof/>
                 <w:webHidden/>
               </w:rPr>
-              <w:instrText xml:space="preserve"> PAGEREF _Toc223504488 \h </w:instrText>
+              <w:instrText xml:space="preserve"> PAGEREF _Toc223604027 \h </w:instrText>
             </w:r>
             <w:r>
               <w:rPr>
@@ -999,7 +996,6 @@
             <w:tabs>
               <w:tab w:val="right" w:leader="dot" w:pos="9345"/>
             </w:tabs>
-            <w:ind w:left="284" w:hanging="284"/>
             <w:rPr>
               <w:rFonts w:asciiTheme="minorHAnsi" w:eastAsiaTheme="minorEastAsia" w:hAnsiTheme="minorHAnsi"/>
               <w:noProof/>
@@ -1010,7 +1006,7 @@
               <w14:ligatures w14:val="standardContextual"/>
             </w:rPr>
           </w:pPr>
-          <w:hyperlink w:anchor="_Toc223504489" w:history="1">
+          <w:hyperlink w:anchor="_Toc223604028" w:history="1">
             <w:r>
               <w:rPr>
                 <w:rStyle w:val="ab"/>
@@ -1045,7 +1041,7 @@
                 <w:noProof/>
                 <w:webHidden/>
               </w:rPr>
-              <w:instrText xml:space="preserve"> PAGEREF _Toc223504489 \h </w:instrText>
+              <w:instrText xml:space="preserve"> PAGEREF _Toc223604028 \h </w:instrText>
             </w:r>
             <w:r>
               <w:rPr>
@@ -1065,7 +1061,7 @@
                 <w:noProof/>
                 <w:webHidden/>
               </w:rPr>
-              <w:t>13</w:t>
+              <w:t>12</w:t>
             </w:r>
             <w:r>
               <w:rPr>
@@ -1082,7 +1078,6 @@
             <w:tabs>
               <w:tab w:val="right" w:leader="dot" w:pos="9345"/>
             </w:tabs>
-            <w:ind w:left="284" w:hanging="284"/>
             <w:rPr>
               <w:rFonts w:asciiTheme="minorHAnsi" w:eastAsiaTheme="minorEastAsia" w:hAnsiTheme="minorHAnsi"/>
               <w:noProof/>
@@ -1093,7 +1088,7 @@
               <w14:ligatures w14:val="standardContextual"/>
             </w:rPr>
           </w:pPr>
-          <w:hyperlink w:anchor="_Toc223504490" w:history="1">
+          <w:hyperlink w:anchor="_Toc223604029" w:history="1">
             <w:r>
               <w:rPr>
                 <w:rStyle w:val="ab"/>
@@ -1120,7 +1115,7 @@
                 <w:noProof/>
                 <w:webHidden/>
               </w:rPr>
-              <w:instrText xml:space="preserve"> PAGEREF _Toc223504490 \h </w:instrText>
+              <w:instrText xml:space="preserve"> PAGEREF _Toc223604029 \h </w:instrText>
             </w:r>
             <w:r>
               <w:rPr>
@@ -1140,7 +1135,410 @@
                 <w:noProof/>
                 <w:webHidden/>
               </w:rPr>
-              <w:t>18</w:t>
+              <w:t>17</w:t>
+            </w:r>
+            <w:r>
+              <w:rPr>
+                <w:noProof/>
+                <w:webHidden/>
+              </w:rPr>
+              <w:fldChar w:fldCharType="end"/>
+            </w:r>
+          </w:hyperlink>
+        </w:p>
+        <w:p>
+          <w:pPr>
+            <w:pStyle w:val="11"/>
+            <w:rPr>
+              <w:rFonts w:asciiTheme="minorHAnsi" w:eastAsiaTheme="minorEastAsia" w:hAnsiTheme="minorHAnsi"/>
+              <w:noProof/>
+              <w:kern w:val="2"/>
+              <w:sz w:val="24"/>
+              <w:szCs w:val="24"/>
+              <w:lang w:eastAsia="ru-RU"/>
+              <w14:ligatures w14:val="standardContextual"/>
+            </w:rPr>
+          </w:pPr>
+          <w:hyperlink w:anchor="_Toc223604030" w:history="1">
+            <w:r>
+              <w:rPr>
+                <w:rStyle w:val="ab"/>
+                <w:noProof/>
+              </w:rPr>
+              <w:t>2.</w:t>
+            </w:r>
+            <w:r>
+              <w:rPr>
+                <w:rFonts w:asciiTheme="minorHAnsi" w:eastAsiaTheme="minorEastAsia" w:hAnsiTheme="minorHAnsi"/>
+                <w:noProof/>
+                <w:kern w:val="2"/>
+                <w:sz w:val="24"/>
+                <w:szCs w:val="24"/>
+                <w:lang w:eastAsia="ru-RU"/>
+                <w14:ligatures w14:val="standardContextual"/>
+              </w:rPr>
+              <w:tab/>
+            </w:r>
+            <w:r>
+              <w:rPr>
+                <w:rStyle w:val="ab"/>
+                <w:noProof/>
+              </w:rPr>
+              <w:t>ТЕСТИРОВАНИЕ И РЕЗУЛЬТАТЫ</w:t>
+            </w:r>
+            <w:r>
+              <w:rPr>
+                <w:noProof/>
+                <w:webHidden/>
+              </w:rPr>
+              <w:tab/>
+            </w:r>
+            <w:r>
+              <w:rPr>
+                <w:noProof/>
+                <w:webHidden/>
+              </w:rPr>
+              <w:fldChar w:fldCharType="begin"/>
+            </w:r>
+            <w:r>
+              <w:rPr>
+                <w:noProof/>
+                <w:webHidden/>
+              </w:rPr>
+              <w:instrText xml:space="preserve"> PAGEREF _Toc223604030 \h </w:instrText>
+            </w:r>
+            <w:r>
+              <w:rPr>
+                <w:noProof/>
+                <w:webHidden/>
+              </w:rPr>
+            </w:r>
+            <w:r>
+              <w:rPr>
+                <w:noProof/>
+                <w:webHidden/>
+              </w:rPr>
+              <w:fldChar w:fldCharType="separate"/>
+            </w:r>
+            <w:r>
+              <w:rPr>
+                <w:noProof/>
+                <w:webHidden/>
+              </w:rPr>
+              <w:t>25</w:t>
+            </w:r>
+            <w:r>
+              <w:rPr>
+                <w:noProof/>
+                <w:webHidden/>
+              </w:rPr>
+              <w:fldChar w:fldCharType="end"/>
+            </w:r>
+          </w:hyperlink>
+        </w:p>
+        <w:p>
+          <w:pPr>
+            <w:pStyle w:val="21"/>
+            <w:tabs>
+              <w:tab w:val="left" w:pos="1680"/>
+              <w:tab w:val="right" w:leader="dot" w:pos="9345"/>
+            </w:tabs>
+            <w:rPr>
+              <w:rFonts w:asciiTheme="minorHAnsi" w:eastAsiaTheme="minorEastAsia" w:hAnsiTheme="minorHAnsi"/>
+              <w:noProof/>
+              <w:kern w:val="2"/>
+              <w:sz w:val="24"/>
+              <w:szCs w:val="24"/>
+              <w:lang w:eastAsia="ru-RU"/>
+              <w14:ligatures w14:val="standardContextual"/>
+            </w:rPr>
+          </w:pPr>
+          <w:hyperlink w:anchor="_Toc223604031" w:history="1">
+            <w:r>
+              <w:rPr>
+                <w:rStyle w:val="ab"/>
+                <w:noProof/>
+                <w:lang w:eastAsia="ru-RU"/>
+              </w:rPr>
+              <w:t>2.1</w:t>
+            </w:r>
+            <w:r>
+              <w:rPr>
+                <w:rFonts w:asciiTheme="minorHAnsi" w:eastAsiaTheme="minorEastAsia" w:hAnsiTheme="minorHAnsi"/>
+                <w:noProof/>
+                <w:kern w:val="2"/>
+                <w:sz w:val="24"/>
+                <w:szCs w:val="24"/>
+                <w:lang w:eastAsia="ru-RU"/>
+                <w14:ligatures w14:val="standardContextual"/>
+              </w:rPr>
+              <w:t xml:space="preserve"> </w:t>
+            </w:r>
+            <w:r>
+              <w:rPr>
+                <w:rStyle w:val="ab"/>
+                <w:noProof/>
+                <w:lang w:eastAsia="ru-RU"/>
+              </w:rPr>
+              <w:t>Тестирование.</w:t>
+            </w:r>
+            <w:r>
+              <w:rPr>
+                <w:noProof/>
+                <w:webHidden/>
+              </w:rPr>
+              <w:tab/>
+            </w:r>
+            <w:r>
+              <w:rPr>
+                <w:noProof/>
+                <w:webHidden/>
+              </w:rPr>
+              <w:fldChar w:fldCharType="begin"/>
+            </w:r>
+            <w:r>
+              <w:rPr>
+                <w:noProof/>
+                <w:webHidden/>
+              </w:rPr>
+              <w:instrText xml:space="preserve"> PAGEREF _Toc223604031 \h </w:instrText>
+            </w:r>
+            <w:r>
+              <w:rPr>
+                <w:noProof/>
+                <w:webHidden/>
+              </w:rPr>
+            </w:r>
+            <w:r>
+              <w:rPr>
+                <w:noProof/>
+                <w:webHidden/>
+              </w:rPr>
+              <w:fldChar w:fldCharType="separate"/>
+            </w:r>
+            <w:r>
+              <w:rPr>
+                <w:noProof/>
+                <w:webHidden/>
+              </w:rPr>
+              <w:t>25</w:t>
+            </w:r>
+            <w:r>
+              <w:rPr>
+                <w:noProof/>
+                <w:webHidden/>
+              </w:rPr>
+              <w:fldChar w:fldCharType="end"/>
+            </w:r>
+          </w:hyperlink>
+        </w:p>
+        <w:p>
+          <w:pPr>
+            <w:pStyle w:val="21"/>
+            <w:tabs>
+              <w:tab w:val="right" w:leader="dot" w:pos="9345"/>
+            </w:tabs>
+            <w:rPr>
+              <w:rFonts w:asciiTheme="minorHAnsi" w:eastAsiaTheme="minorEastAsia" w:hAnsiTheme="minorHAnsi"/>
+              <w:noProof/>
+              <w:kern w:val="2"/>
+              <w:sz w:val="24"/>
+              <w:szCs w:val="24"/>
+              <w:lang w:eastAsia="ru-RU"/>
+              <w14:ligatures w14:val="standardContextual"/>
+            </w:rPr>
+          </w:pPr>
+          <w:hyperlink w:anchor="_Toc223604032" w:history="1">
+            <w:r>
+              <w:rPr>
+                <w:rStyle w:val="ab"/>
+                <w:noProof/>
+                <w:lang w:eastAsia="ru-RU"/>
+              </w:rPr>
+              <w:t>2.2 Результаты</w:t>
+            </w:r>
+            <w:r>
+              <w:rPr>
+                <w:noProof/>
+                <w:webHidden/>
+              </w:rPr>
+              <w:tab/>
+            </w:r>
+            <w:r>
+              <w:rPr>
+                <w:noProof/>
+                <w:webHidden/>
+              </w:rPr>
+              <w:fldChar w:fldCharType="begin"/>
+            </w:r>
+            <w:r>
+              <w:rPr>
+                <w:noProof/>
+                <w:webHidden/>
+              </w:rPr>
+              <w:instrText xml:space="preserve"> PAGEREF _Toc223604032 \h </w:instrText>
+            </w:r>
+            <w:r>
+              <w:rPr>
+                <w:noProof/>
+                <w:webHidden/>
+              </w:rPr>
+            </w:r>
+            <w:r>
+              <w:rPr>
+                <w:noProof/>
+                <w:webHidden/>
+              </w:rPr>
+              <w:fldChar w:fldCharType="separate"/>
+            </w:r>
+            <w:r>
+              <w:rPr>
+                <w:noProof/>
+                <w:webHidden/>
+              </w:rPr>
+              <w:t>26</w:t>
+            </w:r>
+            <w:r>
+              <w:rPr>
+                <w:noProof/>
+                <w:webHidden/>
+              </w:rPr>
+              <w:fldChar w:fldCharType="end"/>
+            </w:r>
+          </w:hyperlink>
+        </w:p>
+        <w:p>
+          <w:pPr>
+            <w:pStyle w:val="11"/>
+            <w:rPr>
+              <w:rFonts w:asciiTheme="minorHAnsi" w:eastAsiaTheme="minorEastAsia" w:hAnsiTheme="minorHAnsi"/>
+              <w:noProof/>
+              <w:kern w:val="2"/>
+              <w:sz w:val="24"/>
+              <w:szCs w:val="24"/>
+              <w:lang w:eastAsia="ru-RU"/>
+              <w14:ligatures w14:val="standardContextual"/>
+            </w:rPr>
+          </w:pPr>
+          <w:hyperlink w:anchor="_Toc223604033" w:history="1">
+            <w:r>
+              <w:rPr>
+                <w:rStyle w:val="ab"/>
+                <w:noProof/>
+              </w:rPr>
+              <w:t>ЗАКЛЮЧЕНИЕ</w:t>
+            </w:r>
+            <w:r>
+              <w:rPr>
+                <w:noProof/>
+                <w:webHidden/>
+              </w:rPr>
+              <w:tab/>
+            </w:r>
+            <w:r>
+              <w:rPr>
+                <w:noProof/>
+                <w:webHidden/>
+              </w:rPr>
+              <w:fldChar w:fldCharType="begin"/>
+            </w:r>
+            <w:r>
+              <w:rPr>
+                <w:noProof/>
+                <w:webHidden/>
+              </w:rPr>
+              <w:instrText xml:space="preserve"> PAGEREF _Toc223604033 \h </w:instrText>
+            </w:r>
+            <w:r>
+              <w:rPr>
+                <w:noProof/>
+                <w:webHidden/>
+              </w:rPr>
+            </w:r>
+            <w:r>
+              <w:rPr>
+                <w:noProof/>
+                <w:webHidden/>
+              </w:rPr>
+              <w:fldChar w:fldCharType="separate"/>
+            </w:r>
+            <w:r>
+              <w:rPr>
+                <w:noProof/>
+                <w:webHidden/>
+              </w:rPr>
+              <w:t>28</w:t>
+            </w:r>
+            <w:r>
+              <w:rPr>
+                <w:noProof/>
+                <w:webHidden/>
+              </w:rPr>
+              <w:fldChar w:fldCharType="end"/>
+            </w:r>
+          </w:hyperlink>
+        </w:p>
+        <w:p>
+          <w:pPr>
+            <w:pStyle w:val="11"/>
+            <w:rPr>
+              <w:rFonts w:asciiTheme="minorHAnsi" w:eastAsiaTheme="minorEastAsia" w:hAnsiTheme="minorHAnsi"/>
+              <w:noProof/>
+              <w:kern w:val="2"/>
+              <w:sz w:val="24"/>
+              <w:szCs w:val="24"/>
+              <w:lang w:eastAsia="ru-RU"/>
+              <w14:ligatures w14:val="standardContextual"/>
+            </w:rPr>
+          </w:pPr>
+          <w:hyperlink w:anchor="_Toc223604034" w:history="1">
+            <w:r>
+              <w:rPr>
+                <w:rStyle w:val="ab"/>
+                <w:noProof/>
+              </w:rPr>
+              <w:t>СПИСОК ЛИТЕРАТУРЫ</w:t>
+            </w:r>
+            <w:r>
+              <w:rPr>
+                <w:noProof/>
+                <w:webHidden/>
+              </w:rPr>
+              <w:tab/>
+            </w:r>
+            <w:r>
+              <w:rPr>
+                <w:noProof/>
+                <w:webHidden/>
+              </w:rPr>
+              <w:fldChar w:fldCharType="begin"/>
+            </w:r>
+            <w:r>
+              <w:rPr>
+                <w:noProof/>
+                <w:webHidden/>
+              </w:rPr>
+              <w:instrText xml:space="preserve"> PAGEREF _Toc223604034 \h </w:instrText>
+            </w:r>
+            <w:r>
+              <w:rPr>
+                <w:noProof/>
+                <w:webHidden/>
+              </w:rPr>
+            </w:r>
+            <w:r>
+              <w:rPr>
+                <w:noProof/>
+                <w:webHidden/>
+              </w:rPr>
+              <w:fldChar w:fldCharType="separate"/>
+            </w:r>
+            <w:r>
+              <w:rPr>
+                <w:noProof/>
+                <w:webHidden/>
+              </w:rPr>
+              <w:t>29</w:t>
             </w:r>
             <w:r>
               <w:rPr>
@@ -1179,9 +1577,10 @@
     <w:p>
       <w:pPr>
         <w:pStyle w:val="1"/>
+        <w:ind w:firstLine="0"/>
         <w:jc w:val="center"/>
       </w:pPr>
-      <w:bookmarkStart w:id="0" w:name="_Toc223504484"/>
+      <w:bookmarkStart w:id="0" w:name="_Toc223604023"/>
       <w:r>
         <w:lastRenderedPageBreak/>
         <w:t>ВВЕДЕНИЕ</w:t>
@@ -1308,7 +1707,7 @@
         </w:numPr>
         <w:jc w:val="center"/>
       </w:pPr>
-      <w:bookmarkStart w:id="1" w:name="_Toc223504485"/>
+      <w:bookmarkStart w:id="1" w:name="_Toc223604024"/>
       <w:r>
         <w:lastRenderedPageBreak/>
         <w:t>РАЗРАБОТКА ПРОЕКТА</w:t>
@@ -1406,7 +1805,7 @@
           <w:lang w:eastAsia="ru-RU"/>
         </w:rPr>
       </w:pPr>
-      <w:bookmarkStart w:id="2" w:name="_Toc223504486"/>
+      <w:bookmarkStart w:id="2" w:name="_Toc223604025"/>
       <w:r>
         <w:rPr>
           <w:lang w:eastAsia="ru-RU"/>
@@ -2472,128 +2871,6 @@
           </w:p>
         </w:tc>
       </w:tr>
-      <w:tr>
-        <w:tc>
-          <w:tcPr>
-            <w:tcW w:w="0" w:type="auto"/>
-          </w:tcPr>
-          <w:p>
-            <w:pPr>
-              <w:spacing w:line="240" w:lineRule="auto"/>
-              <w:ind w:firstLine="0"/>
-              <w:rPr>
-                <w:sz w:val="24"/>
-                <w:szCs w:val="20"/>
-                <w:lang w:eastAsia="ru-RU"/>
-              </w:rPr>
-            </w:pPr>
-            <w:r>
-              <w:rPr>
-                <w:sz w:val="24"/>
-                <w:szCs w:val="20"/>
-                <w:lang w:eastAsia="ru-RU"/>
-              </w:rPr>
-              <w:t>Цена</w:t>
-            </w:r>
-          </w:p>
-        </w:tc>
-        <w:tc>
-          <w:tcPr>
-            <w:tcW w:w="0" w:type="auto"/>
-          </w:tcPr>
-          <w:p>
-            <w:pPr>
-              <w:spacing w:line="240" w:lineRule="auto"/>
-              <w:ind w:firstLine="0"/>
-              <w:rPr>
-                <w:sz w:val="24"/>
-                <w:szCs w:val="20"/>
-                <w:lang w:eastAsia="ru-RU"/>
-              </w:rPr>
-            </w:pPr>
-            <w:r>
-              <w:rPr>
-                <w:sz w:val="24"/>
-                <w:szCs w:val="20"/>
-                <w:lang w:eastAsia="ru-RU"/>
-              </w:rPr>
-              <w:t>4 600 руб.</w:t>
-            </w:r>
-          </w:p>
-        </w:tc>
-        <w:tc>
-          <w:tcPr>
-            <w:tcW w:w="0" w:type="auto"/>
-          </w:tcPr>
-          <w:p>
-            <w:pPr>
-              <w:spacing w:line="240" w:lineRule="auto"/>
-              <w:ind w:firstLine="0"/>
-              <w:rPr>
-                <w:sz w:val="24"/>
-                <w:szCs w:val="20"/>
-                <w:lang w:eastAsia="ru-RU"/>
-              </w:rPr>
-            </w:pPr>
-            <w:r>
-              <w:rPr>
-                <w:sz w:val="24"/>
-                <w:szCs w:val="20"/>
-                <w:lang w:eastAsia="ru-RU"/>
-              </w:rPr>
-              <w:t>38</w:t>
-            </w:r>
-            <w:r>
-              <w:rPr>
-                <w:sz w:val="24"/>
-                <w:szCs w:val="20"/>
-                <w:lang w:eastAsia="ru-RU"/>
-              </w:rPr>
-              <w:t> </w:t>
-            </w:r>
-            <w:r>
-              <w:rPr>
-                <w:sz w:val="24"/>
-                <w:szCs w:val="20"/>
-                <w:lang w:eastAsia="ru-RU"/>
-              </w:rPr>
-              <w:t>700</w:t>
-            </w:r>
-            <w:r>
-              <w:rPr>
-                <w:sz w:val="24"/>
-                <w:szCs w:val="20"/>
-                <w:lang w:eastAsia="ru-RU"/>
-              </w:rPr>
-              <w:t xml:space="preserve"> руб.</w:t>
-            </w:r>
-          </w:p>
-        </w:tc>
-        <w:tc>
-          <w:tcPr>
-            <w:tcW w:w="0" w:type="auto"/>
-          </w:tcPr>
-          <w:p>
-            <w:pPr>
-              <w:spacing w:line="240" w:lineRule="auto"/>
-              <w:ind w:firstLine="0"/>
-              <w:rPr>
-                <w:sz w:val="24"/>
-                <w:szCs w:val="20"/>
-                <w:lang w:eastAsia="ru-RU"/>
-              </w:rPr>
-            </w:pPr>
-            <w:r>
-              <w:rPr>
-                <w:sz w:val="24"/>
-                <w:szCs w:val="20"/>
-                <w:lang w:eastAsia="ru-RU"/>
-              </w:rPr>
-              <w:t>62 000 руб.</w:t>
-            </w:r>
-          </w:p>
-        </w:tc>
-      </w:tr>
     </w:tbl>
     <w:p>
       <w:pPr>
@@ -2756,7 +3033,7 @@
           <w:lang w:eastAsia="ru-RU"/>
         </w:rPr>
       </w:pPr>
-      <w:bookmarkStart w:id="3" w:name="_Toc223504487"/>
+      <w:bookmarkStart w:id="3" w:name="_Toc223604026"/>
       <w:r>
         <w:rPr>
           <w:lang w:eastAsia="ru-RU"/>
@@ -2945,7 +3222,7 @@
           <w:lang w:eastAsia="ru-RU"/>
         </w:rPr>
       </w:pPr>
-      <w:bookmarkStart w:id="4" w:name="_Toc223504488"/>
+      <w:bookmarkStart w:id="4" w:name="_Toc223604027"/>
       <w:r>
         <w:rPr>
           <w:lang w:eastAsia="ru-RU"/>
@@ -4422,6 +4699,7 @@
       </w:pPr>
       <w:r>
         <w:rPr>
+          <w:noProof/>
           <w:lang w:eastAsia="ru-RU"/>
         </w:rPr>
         <w:drawing>
@@ -4520,7 +4798,7 @@
         <w:ind w:firstLine="0"/>
         <w:jc w:val="center"/>
         <w:rPr>
-          <w:lang w:val="en-US" w:eastAsia="ru-RU"/>
+          <w:lang w:eastAsia="ru-RU"/>
         </w:rPr>
       </w:pPr>
     </w:p>
@@ -6100,7 +6378,7 @@
       <w:pPr>
         <w:pStyle w:val="2"/>
       </w:pPr>
-      <w:bookmarkStart w:id="5" w:name="_Toc223504489"/>
+      <w:bookmarkStart w:id="5" w:name="_Toc223604028"/>
       <w:r>
         <w:rPr>
           <w:lang w:val="en-US"/>
@@ -6170,14 +6448,7 @@
           <w:szCs w:val="28"/>
           <w:lang w:eastAsia="ru-RU"/>
         </w:rPr>
-        <w:t>NRF24L01</w:t>
-      </w:r>
-      <w:r>
-        <w:rPr>
-          <w:szCs w:val="28"/>
-          <w:lang w:eastAsia="ru-RU"/>
-        </w:rPr>
-        <w:t>.</w:t>
+        <w:t>NRF24L01.</w:t>
       </w:r>
       <w:r>
         <w:rPr>
@@ -6268,7 +6539,6 @@
         <w:t>, вид сверху</w:t>
       </w:r>
     </w:p>
-    <w:p/>
     <w:p>
       <w:pPr>
         <w:rPr>
@@ -6277,6 +6547,7 @@
         </w:rPr>
       </w:pPr>
       <w:r>
+        <w:lastRenderedPageBreak/>
         <w:t xml:space="preserve">Для большей устойчивости перед шасси закреплена платформа квадратной </w:t>
       </w:r>
       <w:r>
@@ -6311,14 +6582,7 @@
           <w:szCs w:val="28"/>
           <w:lang w:eastAsia="ru-RU"/>
         </w:rPr>
-        <w:t>04</w:t>
-      </w:r>
-      <w:r>
-        <w:rPr>
-          <w:szCs w:val="28"/>
-          <w:lang w:eastAsia="ru-RU"/>
-        </w:rPr>
-        <w:t>.</w:t>
+        <w:t>04.</w:t>
       </w:r>
       <w:r>
         <w:rPr>
@@ -6381,13 +6645,7 @@
         <w:jc w:val="center"/>
       </w:pPr>
       <w:r>
-        <w:t>Рисунок 1.</w:t>
-      </w:r>
-      <w:r>
-        <w:t>5</w:t>
-      </w:r>
-      <w:r>
-        <w:t xml:space="preserve"> – Шасси </w:t>
+        <w:t xml:space="preserve">Рисунок 1.5 – Шасси </w:t>
       </w:r>
       <w:proofErr w:type="spellStart"/>
       <w:r>
@@ -6395,10 +6653,7 @@
       </w:r>
       <w:proofErr w:type="spellEnd"/>
       <w:r>
-        <w:t>, вид с</w:t>
-      </w:r>
-      <w:r>
-        <w:t>переди</w:t>
+        <w:t>, вид спереди</w:t>
       </w:r>
     </w:p>
     <w:p>
@@ -6429,6 +6684,9 @@
         <w:jc w:val="center"/>
       </w:pPr>
       <w:r>
+        <w:rPr>
+          <w:noProof/>
+        </w:rPr>
         <w:lastRenderedPageBreak/>
         <w:drawing>
           <wp:inline distT="0" distB="0" distL="0" distR="0" wp14:anchorId="764C8717" wp14:editId="443AE5A5">
@@ -6497,16 +6755,7 @@
         <w:t>6</w:t>
       </w:r>
       <w:r>
-        <w:t xml:space="preserve"> – </w:t>
-      </w:r>
-      <w:r>
-        <w:t>Манипулятор</w:t>
-      </w:r>
-      <w:r>
-        <w:t>, вид с</w:t>
-      </w:r>
-      <w:r>
-        <w:t>боку</w:t>
+        <w:t xml:space="preserve"> – Манипулятор, вид сбоку</w:t>
       </w:r>
     </w:p>
     <w:p/>
@@ -6557,6 +6806,9 @@
         <w:jc w:val="center"/>
       </w:pPr>
       <w:r>
+        <w:rPr>
+          <w:noProof/>
+        </w:rPr>
         <w:lastRenderedPageBreak/>
         <w:drawing>
           <wp:inline distT="0" distB="0" distL="0" distR="0" wp14:anchorId="55013266" wp14:editId="0B6BA8C0">
@@ -6625,16 +6877,7 @@
         <w:t>7</w:t>
       </w:r>
       <w:r>
-        <w:t xml:space="preserve"> – </w:t>
-      </w:r>
-      <w:r>
-        <w:t>Захватное устройство</w:t>
-      </w:r>
-      <w:r>
-        <w:t>, вид с</w:t>
-      </w:r>
-      <w:r>
-        <w:t>верху</w:t>
+        <w:t xml:space="preserve"> – Захватное устройство, вид сверху</w:t>
       </w:r>
     </w:p>
     <w:p/>
@@ -6644,6 +6887,38 @@
       </w:r>
     </w:p>
     <w:p>
+      <w:r>
+        <w:t>Пульт дистанционного управления представляет собой напечатанный на 3</w:t>
+      </w:r>
+      <w:r>
+        <w:rPr>
+          <w:lang w:val="en-US"/>
+        </w:rPr>
+        <w:t>D</w:t>
+      </w:r>
+      <w:r>
+        <w:t xml:space="preserve"> </w:t>
+      </w:r>
+      <w:r>
+        <w:t>принтере корпус в форме видеоигрового контроллера.</w:t>
+      </w:r>
+      <w:r>
+        <w:t xml:space="preserve"> Исходная модель доступна по ссылке</w:t>
+      </w:r>
+      <w:r>
+        <w:t>:</w:t>
+      </w:r>
+      <w:r>
+        <w:t xml:space="preserve"> «</w:t>
+      </w:r>
+      <w:r>
+        <w:t>https://github.com/demestor/robot_platform/blob/main/pult.obj</w:t>
+      </w:r>
+      <w:r>
+        <w:t xml:space="preserve">». </w:t>
+      </w:r>
+    </w:p>
+    <w:p>
       <w:pPr>
         <w:rPr>
           <w:szCs w:val="28"/>
@@ -6651,63 +6926,49 @@
         </w:rPr>
       </w:pPr>
       <w:r>
-        <w:t>Пульт дистанционного управления представляет собой напечатанный на 3</w:t>
-      </w:r>
-      <w:r>
-        <w:rPr>
-          <w:lang w:val="en-US"/>
-        </w:rPr>
-        <w:t>D</w:t>
-      </w:r>
-      <w:r>
+        <w:t xml:space="preserve">На верхней части корпуса расположен </w:t>
+      </w:r>
+      <w:r>
+        <w:rPr>
+          <w:szCs w:val="28"/>
+        </w:rPr>
+        <w:t xml:space="preserve">радиомодуль </w:t>
+      </w:r>
+      <w:r>
+        <w:rPr>
+          <w:szCs w:val="28"/>
+          <w:lang w:eastAsia="ru-RU"/>
+        </w:rPr>
+        <w:t>NRF24L01</w:t>
+      </w:r>
+      <w:r>
+        <w:rPr>
+          <w:szCs w:val="28"/>
+          <w:lang w:eastAsia="ru-RU"/>
+        </w:rPr>
+        <w:t xml:space="preserve"> закрепленный на 2 винта</w:t>
+      </w:r>
+      <w:r>
+        <w:rPr>
+          <w:szCs w:val="28"/>
+          <w:lang w:eastAsia="ru-RU"/>
+        </w:rPr>
+        <w:t>.</w:t>
+      </w:r>
+      <w:r>
+        <w:rPr>
+          <w:szCs w:val="28"/>
+          <w:lang w:eastAsia="ru-RU"/>
+        </w:rPr>
         <w:t xml:space="preserve"> </w:t>
       </w:r>
       <w:r>
-        <w:t xml:space="preserve">принтере корпус в форме видеоигрового контроллера. На верхней части корпуса расположен </w:t>
-      </w:r>
-      <w:r>
         <w:rPr>
           <w:szCs w:val="28"/>
-        </w:rPr>
-        <w:t xml:space="preserve">радиомодуль </w:t>
-      </w:r>
-      <w:r>
-        <w:rPr>
-          <w:szCs w:val="28"/>
-          <w:lang w:eastAsia="ru-RU"/>
-        </w:rPr>
-        <w:t>NRF24L01</w:t>
-      </w:r>
-      <w:r>
-        <w:rPr>
-          <w:szCs w:val="28"/>
-          <w:lang w:eastAsia="ru-RU"/>
-        </w:rPr>
-        <w:t xml:space="preserve"> закрепленный на 2 винта</w:t>
-      </w:r>
-      <w:r>
-        <w:rPr>
-          <w:szCs w:val="28"/>
-          <w:lang w:eastAsia="ru-RU"/>
-        </w:rPr>
-        <w:t>.</w:t>
-      </w:r>
-      <w:r>
-        <w:rPr>
-          <w:szCs w:val="28"/>
-          <w:lang w:eastAsia="ru-RU"/>
-        </w:rPr>
-        <w:t xml:space="preserve"> </w:t>
-      </w:r>
-      <w:proofErr w:type="spellStart"/>
-      <w:r>
-        <w:rPr>
-          <w:szCs w:val="28"/>
-          <w:lang w:eastAsia="ru-RU"/>
-        </w:rPr>
-        <w:t>Содинительные</w:t>
-      </w:r>
-      <w:proofErr w:type="spellEnd"/>
+          <w:lang w:eastAsia="ru-RU"/>
+        </w:rPr>
+        <w:t>Соединительные</w:t>
+      </w:r>
       <w:r>
         <w:rPr>
           <w:szCs w:val="28"/>
@@ -6836,10 +7097,7 @@
         <w:t>8</w:t>
       </w:r>
       <w:r>
-        <w:t xml:space="preserve"> – </w:t>
-      </w:r>
-      <w:r>
-        <w:t>Пульт дистанционного управления, вид сверху</w:t>
+        <w:t xml:space="preserve"> – Пульт дистанционного управления, вид сверху</w:t>
       </w:r>
     </w:p>
     <w:p/>
@@ -6948,14 +7206,16 @@
     <w:p>
       <w:pPr>
         <w:ind w:firstLine="0"/>
-        <w:jc w:val="center"/>
+        <w:rPr>
+          <w:lang w:val="en-US"/>
+        </w:rPr>
       </w:pPr>
     </w:p>
     <w:p>
       <w:pPr>
         <w:pStyle w:val="2"/>
       </w:pPr>
-      <w:bookmarkStart w:id="6" w:name="_Toc223504490"/>
+      <w:bookmarkStart w:id="6" w:name="_Toc223604029"/>
       <w:r>
         <w:t>1.5 Разработка программного обеспечения</w:t>
       </w:r>
@@ -8147,6 +8407,11 @@
       </w:r>
     </w:p>
     <w:p>
+      <w:pPr>
+        <w:rPr>
+          <w:lang w:val="en-US"/>
+        </w:rPr>
+      </w:pPr>
       <w:r>
         <w:t xml:space="preserve">Далее при помощи метода </w:t>
       </w:r>
@@ -8160,7 +8425,6 @@
         <w:t xml:space="preserve"> устанавливается новое значение для осевых сервоприводов (блок 4) и захватного устройства (блок 5).</w:t>
       </w:r>
     </w:p>
-    <w:p/>
     <w:p>
       <w:pPr>
         <w:spacing w:after="160" w:line="259" w:lineRule="auto"/>
@@ -8181,10 +8445,12 @@
         <w:ind w:left="709" w:firstLine="0"/>
         <w:jc w:val="center"/>
       </w:pPr>
+      <w:bookmarkStart w:id="7" w:name="_Toc223604030"/>
       <w:r>
         <w:lastRenderedPageBreak/>
         <w:t>ТЕСТИРОВАНИЕ И РЕЗУЛЬТАТЫ</w:t>
       </w:r>
+      <w:bookmarkEnd w:id="7"/>
     </w:p>
     <w:p>
       <w:pPr>
@@ -8212,6 +8478,13 @@
         </w:rPr>
         <w:t xml:space="preserve"> с манипулятором, дистанционным управлением и модульной логикой управления.</w:t>
       </w:r>
+    </w:p>
+    <w:p>
+      <w:pPr>
+        <w:rPr>
+          <w:lang w:eastAsia="ru-RU"/>
+        </w:rPr>
+      </w:pPr>
     </w:p>
     <w:p>
       <w:pPr>
@@ -8224,35 +8497,204 @@
           <w:lang w:eastAsia="ru-RU"/>
         </w:rPr>
       </w:pPr>
+      <w:bookmarkStart w:id="8" w:name="_Toc223604031"/>
       <w:r>
         <w:rPr>
           <w:lang w:eastAsia="ru-RU"/>
         </w:rPr>
         <w:t>Тестирование.</w:t>
       </w:r>
-    </w:p>
-    <w:p>
-      <w:pPr>
-        <w:rPr>
-          <w:lang w:eastAsia="ru-RU"/>
-        </w:rPr>
-      </w:pPr>
-      <w:r>
-        <w:rPr>
-          <w:lang w:eastAsia="ru-RU"/>
-        </w:rPr>
-        <w:t>В ходе тестирования были проведены теоретические и практические расчеты. Основной метрикой тестирования является время автономной работы, расчет проводился отдельно для основного микроконтроллера и микроконтроллера сервопривод. Для расчетов использовались следующие значения потребления тока</w:t>
-      </w:r>
-      <w:r>
+      <w:bookmarkEnd w:id="8"/>
+    </w:p>
+    <w:p>
+      <w:pPr>
+        <w:rPr>
+          <w:lang w:eastAsia="ru-RU"/>
+        </w:rPr>
+      </w:pPr>
+      <w:r>
+        <w:rPr>
+          <w:lang w:eastAsia="ru-RU"/>
+        </w:rPr>
+        <w:t>В ходе тестирования были проведены теоретические и практические расчеты. Основной метрикой тестирования является время автономной работы</w:t>
+      </w:r>
+      <w:r>
+        <w:rPr>
+          <w:lang w:eastAsia="ru-RU"/>
+        </w:rPr>
+        <w:t>. Р</w:t>
+      </w:r>
+      <w:r>
+        <w:rPr>
+          <w:lang w:eastAsia="ru-RU"/>
+        </w:rPr>
+        <w:t xml:space="preserve">асчет проводился отдельно для основного микроконтроллера и микроконтроллера сервопривод. </w:t>
+      </w:r>
+    </w:p>
+    <w:p>
+      <w:pPr>
         <w:rPr>
           <w:lang w:val="en-US" w:eastAsia="ru-RU"/>
         </w:rPr>
+      </w:pPr>
+      <w:r>
+        <w:rPr>
+          <w:lang w:eastAsia="ru-RU"/>
+        </w:rPr>
+        <w:t>Время автономной работы рассчитывается по формуле</w:t>
+      </w:r>
+      <w:r>
+        <w:rPr>
+          <w:lang w:eastAsia="ru-RU"/>
+        </w:rPr>
+        <w:t xml:space="preserve">: </w:t>
+      </w:r>
+    </w:p>
+    <w:p>
+      <w:pPr>
+        <w:rPr>
+          <w:rFonts w:eastAsiaTheme="minorEastAsia"/>
+          <w:lang w:val="en-US" w:eastAsia="ru-RU"/>
+        </w:rPr>
+      </w:pPr>
+      <m:oMath>
+        <m:r>
+          <w:rPr>
+            <w:rFonts w:ascii="Cambria Math" w:hAnsi="Cambria Math"/>
+            <w:lang w:val="en-US" w:eastAsia="ru-RU"/>
+          </w:rPr>
+          <m:t>T=C×0,85/I</m:t>
+        </m:r>
+      </m:oMath>
+      <w:r>
+        <w:rPr>
+          <w:rFonts w:eastAsiaTheme="minorEastAsia"/>
+          <w:lang w:val="en-US" w:eastAsia="ru-RU"/>
+        </w:rPr>
+        <w:t xml:space="preserve"> </w:t>
+      </w:r>
+    </w:p>
+    <w:p>
+      <w:pPr>
+        <w:rPr>
+          <w:rFonts w:eastAsiaTheme="minorEastAsia"/>
+          <w:lang w:eastAsia="ru-RU"/>
+        </w:rPr>
+      </w:pPr>
+      <w:r>
+        <w:rPr>
+          <w:rFonts w:eastAsiaTheme="minorEastAsia"/>
+          <w:lang w:eastAsia="ru-RU"/>
+        </w:rPr>
+        <w:t>где</w:t>
+      </w:r>
+      <w:r>
+        <w:rPr>
+          <w:rFonts w:eastAsiaTheme="minorEastAsia"/>
+          <w:lang w:eastAsia="ru-RU"/>
+        </w:rPr>
         <w:t>:</w:t>
       </w:r>
     </w:p>
     <w:p>
       <w:pPr>
         <w:rPr>
+          <w:rFonts w:eastAsiaTheme="minorEastAsia"/>
+          <w:lang w:eastAsia="ru-RU"/>
+        </w:rPr>
+      </w:pPr>
+      <m:oMath>
+        <m:r>
+          <w:rPr>
+            <w:rFonts w:ascii="Cambria Math" w:hAnsi="Cambria Math"/>
+            <w:lang w:val="en-US" w:eastAsia="ru-RU"/>
+          </w:rPr>
+          <m:t>C</m:t>
+        </m:r>
+      </m:oMath>
+      <w:r>
+        <w:rPr>
+          <w:rFonts w:eastAsiaTheme="minorEastAsia"/>
+          <w:lang w:eastAsia="ru-RU"/>
+        </w:rPr>
+        <w:t xml:space="preserve"> – </w:t>
+      </w:r>
+      <w:r>
+        <w:rPr>
+          <w:rFonts w:eastAsiaTheme="minorEastAsia"/>
+          <w:lang w:eastAsia="ru-RU"/>
+        </w:rPr>
+        <w:t>ёмкость батареи, мАч</w:t>
+      </w:r>
+    </w:p>
+    <w:p>
+      <w:pPr>
+        <w:rPr>
+          <w:rFonts w:eastAsiaTheme="minorEastAsia"/>
+          <w:lang w:eastAsia="ru-RU"/>
+        </w:rPr>
+      </w:pPr>
+      <m:oMath>
+        <m:r>
+          <w:rPr>
+            <w:rFonts w:ascii="Cambria Math" w:hAnsi="Cambria Math"/>
+            <w:lang w:val="en-US" w:eastAsia="ru-RU"/>
+          </w:rPr>
+          <m:t>I</m:t>
+        </m:r>
+      </m:oMath>
+      <w:r>
+        <w:rPr>
+          <w:rFonts w:eastAsiaTheme="minorEastAsia"/>
+          <w:lang w:eastAsia="ru-RU"/>
+        </w:rPr>
+        <w:t xml:space="preserve"> </w:t>
+      </w:r>
+      <w:r>
+        <w:rPr>
+          <w:rFonts w:eastAsiaTheme="minorEastAsia"/>
+          <w:lang w:eastAsia="ru-RU"/>
+        </w:rPr>
+        <w:t>– средний ток потребления</w:t>
+      </w:r>
+    </w:p>
+    <w:p>
+      <w:pPr>
+        <w:rPr>
+          <w:rFonts w:eastAsiaTheme="minorEastAsia"/>
+          <w:lang w:eastAsia="ru-RU"/>
+        </w:rPr>
+      </w:pPr>
+      <w:r>
+        <w:rPr>
+          <w:rFonts w:eastAsiaTheme="minorEastAsia"/>
+          <w:lang w:eastAsia="ru-RU"/>
+        </w:rPr>
+        <w:t>Значение 0,85 означает коэффициент полезного использования ёмкости аккумулятора, введенный для того, чтобы не допустить глубокой разрядки аккумулятора.</w:t>
+      </w:r>
+    </w:p>
+    <w:p>
+      <w:pPr>
+        <w:rPr>
+          <w:lang w:eastAsia="ru-RU"/>
+        </w:rPr>
+      </w:pPr>
+      <w:r>
+        <w:rPr>
+          <w:lang w:eastAsia="ru-RU"/>
+        </w:rPr>
+        <w:t>Для расчетов использовались следующие значения потребления тока</w:t>
+      </w:r>
+      <w:r>
+        <w:rPr>
+          <w:lang w:eastAsia="ru-RU"/>
+        </w:rPr>
+        <w:t>:</w:t>
+      </w:r>
+    </w:p>
+    <w:p>
+      <w:pPr>
+        <w:rPr>
           <w:lang w:eastAsia="ru-RU"/>
         </w:rPr>
       </w:pPr>
@@ -8260,7 +8702,31 @@
         <w:rPr>
           <w:lang w:val="en-US" w:eastAsia="ru-RU"/>
         </w:rPr>
-        <w:t xml:space="preserve">Iskra Uno – 40-60 </w:t>
+        <w:t>Iskra</w:t>
+      </w:r>
+      <w:r>
+        <w:rPr>
+          <w:lang w:eastAsia="ru-RU"/>
+        </w:rPr>
+        <w:t xml:space="preserve"> </w:t>
+      </w:r>
+      <w:r>
+        <w:rPr>
+          <w:lang w:val="en-US" w:eastAsia="ru-RU"/>
+        </w:rPr>
+        <w:t>Uno</w:t>
+      </w:r>
+      <w:r>
+        <w:rPr>
+          <w:lang w:val="en-US" w:eastAsia="ru-RU"/>
+        </w:rPr>
+        <w:t>:</w:t>
+      </w:r>
+      <w:r>
+        <w:rPr>
+          <w:lang w:eastAsia="ru-RU"/>
+        </w:rPr>
+        <w:t xml:space="preserve"> 40-60 </w:t>
       </w:r>
       <w:r>
         <w:rPr>
@@ -8279,7 +8745,37 @@
         <w:rPr>
           <w:lang w:val="en-US" w:eastAsia="ru-RU"/>
         </w:rPr>
-        <w:t xml:space="preserve">NRF24L01 – </w:t>
+        <w:t>NRF</w:t>
+      </w:r>
+      <w:r>
+        <w:rPr>
+          <w:lang w:eastAsia="ru-RU"/>
+        </w:rPr>
+        <w:t>24</w:t>
+      </w:r>
+      <w:r>
+        <w:rPr>
+          <w:lang w:val="en-US" w:eastAsia="ru-RU"/>
+        </w:rPr>
+        <w:t>L</w:t>
+      </w:r>
+      <w:r>
+        <w:rPr>
+          <w:lang w:eastAsia="ru-RU"/>
+        </w:rPr>
+        <w:t>01</w:t>
+      </w:r>
+      <w:r>
+        <w:rPr>
+          <w:lang w:val="en-US" w:eastAsia="ru-RU"/>
+        </w:rPr>
+        <w:t>:</w:t>
+      </w:r>
+      <w:r>
+        <w:rPr>
+          <w:lang w:eastAsia="ru-RU"/>
+        </w:rPr>
+        <w:t xml:space="preserve"> </w:t>
       </w:r>
       <w:r>
         <w:rPr>
@@ -8289,55 +8785,790 @@
       </w:r>
       <w:r>
         <w:rPr>
+          <w:lang w:eastAsia="ru-RU"/>
+        </w:rPr>
+        <w:t xml:space="preserve"> </w:t>
+      </w:r>
+      <w:r>
+        <w:rPr>
+          <w:lang w:eastAsia="ru-RU"/>
+        </w:rPr>
+        <w:t>мА</w:t>
+      </w:r>
+      <w:r>
+        <w:rPr>
+          <w:lang w:eastAsia="ru-RU"/>
+        </w:rPr>
+        <w:t xml:space="preserve"> (режим приема)</w:t>
+      </w:r>
+    </w:p>
+    <w:p>
+      <w:pPr>
+        <w:rPr>
+          <w:lang w:eastAsia="ru-RU"/>
+        </w:rPr>
+      </w:pPr>
+      <w:r>
+        <w:rPr>
           <w:lang w:val="en-US" w:eastAsia="ru-RU"/>
         </w:rPr>
+        <w:t>HC</w:t>
+      </w:r>
+      <w:r>
+        <w:rPr>
+          <w:lang w:eastAsia="ru-RU"/>
+        </w:rPr>
+        <w:t>-</w:t>
+      </w:r>
+      <w:r>
+        <w:rPr>
+          <w:lang w:val="en-US" w:eastAsia="ru-RU"/>
+        </w:rPr>
+        <w:t>SR</w:t>
+      </w:r>
+      <w:r>
+        <w:rPr>
+          <w:lang w:eastAsia="ru-RU"/>
+        </w:rPr>
+        <w:t>04</w:t>
+      </w:r>
+      <w:r>
+        <w:rPr>
+          <w:lang w:eastAsia="ru-RU"/>
+        </w:rPr>
+        <w:t xml:space="preserve">: </w:t>
+      </w:r>
+      <w:r>
+        <w:rPr>
+          <w:lang w:eastAsia="ru-RU"/>
+        </w:rPr>
+        <w:t xml:space="preserve">15 </w:t>
+      </w:r>
+      <w:r>
+        <w:rPr>
+          <w:lang w:eastAsia="ru-RU"/>
+        </w:rPr>
+        <w:t>мА</w:t>
+      </w:r>
+    </w:p>
+    <w:p>
+      <w:pPr>
+        <w:rPr>
+          <w:lang w:eastAsia="ru-RU"/>
+        </w:rPr>
+      </w:pPr>
+      <w:r>
+        <w:rPr>
+          <w:lang w:eastAsia="ru-RU"/>
+        </w:rPr>
+        <w:t>PDI-6225MG-300</w:t>
+      </w:r>
+      <w:r>
+        <w:rPr>
+          <w:lang w:eastAsia="ru-RU"/>
+        </w:rPr>
+        <w:t>:</w:t>
+      </w:r>
+      <w:r>
+        <w:rPr>
+          <w:lang w:eastAsia="ru-RU"/>
+        </w:rPr>
         <w:t xml:space="preserve"> </w:t>
       </w:r>
       <w:r>
         <w:rPr>
           <w:lang w:eastAsia="ru-RU"/>
         </w:rPr>
+        <w:t>3 * 650 = 1950</w:t>
+      </w:r>
+      <w:r>
+        <w:rPr>
+          <w:lang w:eastAsia="ru-RU"/>
+        </w:rPr>
+        <w:t xml:space="preserve"> </w:t>
+      </w:r>
+      <w:r>
+        <w:rPr>
+          <w:lang w:eastAsia="ru-RU"/>
+        </w:rPr>
+        <w:t>мА (холостой ход)</w:t>
+      </w:r>
+    </w:p>
+    <w:p>
+      <w:pPr>
+        <w:rPr>
+          <w:lang w:val="en-US" w:eastAsia="ru-RU"/>
+        </w:rPr>
+      </w:pPr>
+      <w:r>
+        <w:rPr>
+          <w:lang w:eastAsia="ru-RU"/>
+        </w:rPr>
+        <w:t>ДПТ</w:t>
+      </w:r>
+      <w:r>
+        <w:rPr>
+          <w:lang w:val="en-US" w:eastAsia="ru-RU"/>
+        </w:rPr>
+        <w:t xml:space="preserve">: 2 * 500 = 1000 </w:t>
+      </w:r>
+      <w:r>
+        <w:rPr>
+          <w:lang w:eastAsia="ru-RU"/>
+        </w:rPr>
         <w:t>мА</w:t>
       </w:r>
     </w:p>
     <w:p>
       <w:pPr>
         <w:rPr>
-          <w:lang w:eastAsia="ru-RU"/>
-        </w:rPr>
-      </w:pPr>
-      <w:r>
-        <w:rPr>
           <w:lang w:val="en-US" w:eastAsia="ru-RU"/>
         </w:rPr>
-        <w:t>HC-SR04</w:t>
+      </w:pPr>
+      <w:r>
+        <w:rPr>
+          <w:lang w:eastAsia="ru-RU"/>
+        </w:rPr>
+        <w:t>Средний потребляемый ток</w:t>
       </w:r>
       <w:r>
         <w:rPr>
           <w:lang w:val="en-US" w:eastAsia="ru-RU"/>
         </w:rPr>
-        <w:t xml:space="preserve"> – 15 </w:t>
-      </w:r>
-      <w:r>
-        <w:rPr>
-          <w:lang w:eastAsia="ru-RU"/>
-        </w:rPr>
-        <w:t>мА</w:t>
-      </w:r>
-    </w:p>
-    <w:p>
-      <w:pPr>
-        <w:rPr>
-          <w:lang w:eastAsia="ru-RU"/>
-        </w:rPr>
-      </w:pPr>
-    </w:p>
-    <w:p>
-      <w:pPr>
-        <w:rPr>
-          <w:lang w:eastAsia="ru-RU"/>
-        </w:rPr>
-      </w:pPr>
+        <w:t>:</w:t>
+      </w:r>
+    </w:p>
+    <w:p>
+      <w:pPr>
+        <w:tabs>
+          <w:tab w:val="left" w:pos="7404"/>
+        </w:tabs>
+        <w:rPr>
+          <w:lang w:eastAsia="ru-RU"/>
+        </w:rPr>
+      </w:pPr>
+      <w:r>
+        <w:rPr>
+          <w:lang w:eastAsia="ru-RU"/>
+        </w:rPr>
+        <w:t>Для мобильного шасси</w:t>
+      </w:r>
+      <w:r>
+        <w:rPr>
+          <w:lang w:eastAsia="ru-RU"/>
+        </w:rPr>
+        <w:t xml:space="preserve">: </w:t>
+      </w:r>
+      <m:oMath>
+        <m:r>
+          <w:rPr>
+            <w:rFonts w:ascii="Cambria Math" w:hAnsi="Cambria Math"/>
+            <w:lang w:eastAsia="ru-RU"/>
+          </w:rPr>
+          <m:t>60 + 13 + 15 + 1000 = 1088 мА</m:t>
+        </m:r>
+      </m:oMath>
+    </w:p>
+    <w:p>
+      <w:pPr>
+        <w:rPr>
+          <w:lang w:eastAsia="ru-RU"/>
+        </w:rPr>
+      </w:pPr>
+      <w:r>
+        <w:rPr>
+          <w:lang w:eastAsia="ru-RU"/>
+        </w:rPr>
+        <w:t>Для манипулятора</w:t>
+      </w:r>
+      <w:r>
+        <w:rPr>
+          <w:lang w:eastAsia="ru-RU"/>
+        </w:rPr>
+        <w:t xml:space="preserve">: </w:t>
+      </w:r>
+      <m:oMath>
+        <m:r>
+          <w:rPr>
+            <w:rFonts w:ascii="Cambria Math" w:hAnsi="Cambria Math"/>
+            <w:lang w:eastAsia="ru-RU"/>
+          </w:rPr>
+          <m:t>60 + 1950 = 2010 мА</m:t>
+        </m:r>
+      </m:oMath>
+    </w:p>
+    <w:p>
+      <w:pPr>
+        <w:rPr>
+          <w:lang w:eastAsia="ru-RU"/>
+        </w:rPr>
+      </w:pPr>
+      <w:r>
+        <w:rPr>
+          <w:lang w:eastAsia="ru-RU"/>
+        </w:rPr>
+        <w:t>Емкость аккумуляторах блоков</w:t>
+      </w:r>
+      <w:r>
+        <w:rPr>
+          <w:lang w:eastAsia="ru-RU"/>
+        </w:rPr>
+        <w:t>:</w:t>
+      </w:r>
+    </w:p>
+    <w:p>
+      <w:pPr>
+        <w:rPr>
+          <w:lang w:eastAsia="ru-RU"/>
+        </w:rPr>
+      </w:pPr>
+      <w:r>
+        <w:rPr>
+          <w:lang w:eastAsia="ru-RU"/>
+        </w:rPr>
+        <w:lastRenderedPageBreak/>
+        <w:t>Для мобильного шасси</w:t>
+      </w:r>
+      <w:r>
+        <w:rPr>
+          <w:lang w:eastAsia="ru-RU"/>
+        </w:rPr>
+        <w:t>:</w:t>
+      </w:r>
+      <w:r>
+        <w:rPr>
+          <w:lang w:eastAsia="ru-RU"/>
+        </w:rPr>
+        <w:t xml:space="preserve"> </w:t>
+      </w:r>
+      <m:oMath>
+        <m:r>
+          <w:rPr>
+            <w:rFonts w:ascii="Cambria Math" w:hAnsi="Cambria Math"/>
+            <w:lang w:eastAsia="ru-RU"/>
+          </w:rPr>
+          <m:t>3 * 12 000 = 36 000 мАч</m:t>
+        </m:r>
+      </m:oMath>
+    </w:p>
+    <w:p>
+      <w:pPr>
+        <w:rPr>
+          <w:lang w:eastAsia="ru-RU"/>
+        </w:rPr>
+      </w:pPr>
+      <w:r>
+        <w:rPr>
+          <w:lang w:eastAsia="ru-RU"/>
+        </w:rPr>
+        <w:t>Для манипулятора</w:t>
+      </w:r>
+      <w:r>
+        <w:rPr>
+          <w:lang w:eastAsia="ru-RU"/>
+        </w:rPr>
+        <w:t xml:space="preserve">: </w:t>
+      </w:r>
+      <m:oMath>
+        <m:r>
+          <w:rPr>
+            <w:rFonts w:ascii="Cambria Math" w:hAnsi="Cambria Math"/>
+            <w:lang w:eastAsia="ru-RU"/>
+          </w:rPr>
+          <m:t>2 * 12 000 = 24 000 мАч</m:t>
+        </m:r>
+      </m:oMath>
+    </w:p>
+    <w:p>
+      <w:pPr>
+        <w:rPr>
+          <w:lang w:eastAsia="ru-RU"/>
+        </w:rPr>
+      </w:pPr>
+      <w:r>
+        <w:rPr>
+          <w:lang w:eastAsia="ru-RU"/>
+        </w:rPr>
+        <w:t>Рассчитанное время работы</w:t>
+      </w:r>
+      <w:r>
+        <w:rPr>
+          <w:lang w:eastAsia="ru-RU"/>
+        </w:rPr>
+        <w:t>:</w:t>
+      </w:r>
+    </w:p>
+    <w:p>
+      <w:pPr>
+        <w:rPr>
+          <w:rFonts w:eastAsiaTheme="minorEastAsia"/>
+          <w:lang w:eastAsia="ru-RU"/>
+        </w:rPr>
+      </w:pPr>
+      <w:r>
+        <w:rPr>
+          <w:lang w:eastAsia="ru-RU"/>
+        </w:rPr>
+        <w:t xml:space="preserve">Для </w:t>
+      </w:r>
+      <w:r>
+        <w:rPr>
+          <w:lang w:eastAsia="ru-RU"/>
+        </w:rPr>
+        <w:t>мобильного шасси</w:t>
+      </w:r>
+      <w:r>
+        <w:rPr>
+          <w:lang w:eastAsia="ru-RU"/>
+        </w:rPr>
+        <w:t xml:space="preserve">: </w:t>
+      </w:r>
+      <m:oMath>
+        <m:r>
+          <w:rPr>
+            <w:rFonts w:ascii="Cambria Math" w:hAnsi="Cambria Math"/>
+            <w:lang w:eastAsia="ru-RU"/>
+          </w:rPr>
+          <m:t>36</m:t>
+        </m:r>
+        <m:r>
+          <w:rPr>
+            <w:rFonts w:ascii="Cambria Math" w:hAnsi="Cambria Math"/>
+            <w:lang w:eastAsia="ru-RU"/>
+          </w:rPr>
+          <m:t xml:space="preserve"> </m:t>
+        </m:r>
+        <m:r>
+          <w:rPr>
+            <w:rFonts w:ascii="Cambria Math" w:hAnsi="Cambria Math"/>
+            <w:lang w:eastAsia="ru-RU"/>
+          </w:rPr>
+          <m:t>000</m:t>
+        </m:r>
+        <m:r>
+          <w:rPr>
+            <w:rFonts w:ascii="Cambria Math" w:hAnsi="Cambria Math"/>
+            <w:lang w:eastAsia="ru-RU"/>
+          </w:rPr>
+          <m:t>*</m:t>
+        </m:r>
+        <m:r>
+          <w:rPr>
+            <w:rFonts w:ascii="Cambria Math" w:hAnsi="Cambria Math"/>
+            <w:lang w:eastAsia="ru-RU"/>
+          </w:rPr>
+          <m:t>0,85/</m:t>
+        </m:r>
+        <m:r>
+          <w:rPr>
+            <w:rFonts w:ascii="Cambria Math" w:eastAsiaTheme="minorEastAsia" w:hAnsi="Cambria Math"/>
+            <w:lang w:eastAsia="ru-RU"/>
+          </w:rPr>
+          <m:t>1088</m:t>
+        </m:r>
+      </m:oMath>
+      <w:r>
+        <w:rPr>
+          <w:rFonts w:eastAsiaTheme="minorEastAsia"/>
+          <w:lang w:eastAsia="ru-RU"/>
+        </w:rPr>
+        <w:t xml:space="preserve"> = </w:t>
+      </w:r>
+      <w:r>
+        <w:rPr>
+          <w:rFonts w:eastAsiaTheme="minorEastAsia"/>
+          <w:lang w:eastAsia="ru-RU"/>
+        </w:rPr>
+        <w:t>28 часов</w:t>
+      </w:r>
+    </w:p>
+    <w:p>
+      <w:pPr>
+        <w:rPr>
+          <w:i/>
+          <w:lang w:eastAsia="ru-RU"/>
+        </w:rPr>
+      </w:pPr>
+      <w:r>
+        <w:rPr>
+          <w:rFonts w:eastAsiaTheme="minorEastAsia"/>
+          <w:lang w:eastAsia="ru-RU"/>
+        </w:rPr>
+        <w:t>Для манипулятора</w:t>
+      </w:r>
+      <w:r>
+        <w:rPr>
+          <w:rFonts w:eastAsiaTheme="minorEastAsia"/>
+          <w:lang w:eastAsia="ru-RU"/>
+        </w:rPr>
+        <w:t xml:space="preserve">: </w:t>
+      </w:r>
+      <m:oMath>
+        <m:r>
+          <w:rPr>
+            <w:rFonts w:ascii="Cambria Math" w:eastAsiaTheme="minorEastAsia" w:hAnsi="Cambria Math"/>
+            <w:lang w:eastAsia="ru-RU"/>
+          </w:rPr>
+          <m:t>24 000*0,85</m:t>
+        </m:r>
+        <m:r>
+          <w:rPr>
+            <w:rFonts w:ascii="Cambria Math" w:eastAsiaTheme="minorEastAsia" w:hAnsi="Cambria Math"/>
+            <w:lang w:val="en-US" w:eastAsia="ru-RU"/>
+          </w:rPr>
+          <m:t>/2010=10</m:t>
+        </m:r>
+      </m:oMath>
+      <w:r>
+        <w:rPr>
+          <w:rFonts w:eastAsiaTheme="minorEastAsia"/>
+          <w:lang w:eastAsia="ru-RU"/>
+        </w:rPr>
+        <w:t xml:space="preserve"> часов</w:t>
+      </w:r>
+    </w:p>
+    <w:p>
+      <w:pPr>
+        <w:ind w:firstLine="0"/>
+        <w:rPr>
+          <w:lang w:val="en-US" w:eastAsia="ru-RU"/>
+        </w:rPr>
+      </w:pPr>
+      <w:r>
+        <w:rPr>
+          <w:lang w:eastAsia="ru-RU"/>
+        </w:rPr>
+        <w:tab/>
+        <w:t>Следующие метрики определены как вспомогательные</w:t>
+      </w:r>
+      <w:r>
+        <w:rPr>
+          <w:lang w:eastAsia="ru-RU"/>
+        </w:rPr>
+        <w:t xml:space="preserve"> </w:t>
+      </w:r>
+      <w:r>
+        <w:rPr>
+          <w:lang w:eastAsia="ru-RU"/>
+        </w:rPr>
+        <w:t>и рассчитаны на основе данных из технической документации модулей</w:t>
+      </w:r>
+      <w:r>
+        <w:rPr>
+          <w:lang w:eastAsia="ru-RU"/>
+        </w:rPr>
+        <w:t>:</w:t>
+      </w:r>
+    </w:p>
+    <w:p>
+      <w:pPr>
+        <w:ind w:firstLine="0"/>
+        <w:rPr>
+          <w:lang w:eastAsia="ru-RU"/>
+        </w:rPr>
+      </w:pPr>
+      <w:r>
+        <w:rPr>
+          <w:lang w:eastAsia="ru-RU"/>
+        </w:rPr>
+        <w:tab/>
+        <w:t>Дальность приема сигнала радиомодулем</w:t>
+      </w:r>
+      <w:r>
+        <w:rPr>
+          <w:lang w:eastAsia="ru-RU"/>
+        </w:rPr>
+        <w:t xml:space="preserve">: </w:t>
+      </w:r>
+      <w:r>
+        <w:rPr>
+          <w:lang w:eastAsia="ru-RU"/>
+        </w:rPr>
+        <w:t>более 100 м</w:t>
+      </w:r>
+      <w:r>
+        <w:rPr>
+          <w:lang w:eastAsia="ru-RU"/>
+        </w:rPr>
+        <w:t>;</w:t>
+      </w:r>
+    </w:p>
+    <w:p>
+      <w:pPr>
+        <w:ind w:firstLine="0"/>
+        <w:rPr>
+          <w:rFonts w:cs="Times New Roman"/>
+          <w:sz w:val="24"/>
+          <w:szCs w:val="20"/>
+          <w:lang w:eastAsia="ru-RU"/>
+        </w:rPr>
+      </w:pPr>
+      <w:r>
+        <w:rPr>
+          <w:lang w:eastAsia="ru-RU"/>
+        </w:rPr>
+        <w:tab/>
+      </w:r>
+      <w:r>
+        <w:rPr>
+          <w:lang w:eastAsia="ru-RU"/>
+        </w:rPr>
+        <w:t xml:space="preserve">Диапазон углов вращения внешнего вала сервопривода оси </w:t>
+      </w:r>
+      <w:r>
+        <w:rPr>
+          <w:lang w:val="en-US" w:eastAsia="ru-RU"/>
+        </w:rPr>
+        <w:t>X</w:t>
+      </w:r>
+      <w:r>
+        <w:rPr>
+          <w:lang w:eastAsia="ru-RU"/>
+        </w:rPr>
+        <w:t xml:space="preserve">: </w:t>
+      </w:r>
+      <w:r>
+        <w:rPr>
+          <w:lang w:eastAsia="ru-RU"/>
+        </w:rPr>
+        <w:t>90</w:t>
+      </w:r>
+      <w:r>
+        <w:rPr>
+          <w:rFonts w:cs="Times New Roman"/>
+          <w:sz w:val="24"/>
+          <w:szCs w:val="20"/>
+          <w:lang w:eastAsia="ru-RU"/>
+        </w:rPr>
+        <w:t>°</w:t>
+      </w:r>
+      <w:r>
+        <w:rPr>
+          <w:rFonts w:cs="Times New Roman"/>
+          <w:sz w:val="24"/>
+          <w:szCs w:val="20"/>
+          <w:lang w:eastAsia="ru-RU"/>
+        </w:rPr>
+        <w:t>–170°</w:t>
+      </w:r>
+      <w:r>
+        <w:rPr>
+          <w:rFonts w:cs="Times New Roman"/>
+          <w:sz w:val="24"/>
+          <w:szCs w:val="20"/>
+          <w:lang w:eastAsia="ru-RU"/>
+        </w:rPr>
+        <w:t>;</w:t>
+      </w:r>
+    </w:p>
+    <w:p>
+      <w:pPr>
+        <w:ind w:firstLine="0"/>
+        <w:rPr>
+          <w:rFonts w:cs="Times New Roman"/>
+          <w:sz w:val="24"/>
+          <w:szCs w:val="20"/>
+          <w:lang w:eastAsia="ru-RU"/>
+        </w:rPr>
+      </w:pPr>
+      <w:r>
+        <w:rPr>
+          <w:rFonts w:cs="Times New Roman"/>
+          <w:sz w:val="24"/>
+          <w:szCs w:val="20"/>
+          <w:lang w:eastAsia="ru-RU"/>
+        </w:rPr>
+        <w:tab/>
+      </w:r>
+      <w:r>
+        <w:rPr>
+          <w:lang w:eastAsia="ru-RU"/>
+        </w:rPr>
+        <w:t xml:space="preserve">Диапазон углов вращения внешнего вала сервопривода оси </w:t>
+      </w:r>
+      <w:r>
+        <w:rPr>
+          <w:lang w:val="en-US" w:eastAsia="ru-RU"/>
+        </w:rPr>
+        <w:t>Y</w:t>
+      </w:r>
+      <w:r>
+        <w:rPr>
+          <w:lang w:eastAsia="ru-RU"/>
+        </w:rPr>
+        <w:t xml:space="preserve">: </w:t>
+      </w:r>
+      <w:r>
+        <w:rPr>
+          <w:lang w:eastAsia="ru-RU"/>
+        </w:rPr>
+        <w:t>30</w:t>
+      </w:r>
+      <w:r>
+        <w:rPr>
+          <w:rFonts w:cs="Times New Roman"/>
+          <w:sz w:val="24"/>
+          <w:szCs w:val="20"/>
+          <w:lang w:eastAsia="ru-RU"/>
+        </w:rPr>
+        <w:t>°</w:t>
+      </w:r>
+      <w:r>
+        <w:rPr>
+          <w:rFonts w:cs="Times New Roman"/>
+          <w:sz w:val="24"/>
+          <w:szCs w:val="20"/>
+          <w:lang w:eastAsia="ru-RU"/>
+        </w:rPr>
+        <w:t>–150°</w:t>
+      </w:r>
+      <w:r>
+        <w:rPr>
+          <w:rFonts w:cs="Times New Roman"/>
+          <w:sz w:val="24"/>
+          <w:szCs w:val="20"/>
+          <w:lang w:eastAsia="ru-RU"/>
+        </w:rPr>
+        <w:t>;</w:t>
+      </w:r>
+    </w:p>
+    <w:p>
+      <w:pPr>
+        <w:ind w:firstLine="0"/>
+        <w:rPr>
+          <w:lang w:eastAsia="ru-RU"/>
+        </w:rPr>
+      </w:pPr>
+      <w:r>
+        <w:rPr>
+          <w:lang w:eastAsia="ru-RU"/>
+        </w:rPr>
+        <w:tab/>
+      </w:r>
+      <w:r>
+        <w:rPr>
+          <w:lang w:eastAsia="ru-RU"/>
+        </w:rPr>
+        <w:t>Максимальная дальность измерения ультразвукового дальномера</w:t>
+      </w:r>
+      <w:r>
+        <w:rPr>
+          <w:lang w:eastAsia="ru-RU"/>
+        </w:rPr>
+        <w:t xml:space="preserve">: </w:t>
+      </w:r>
+      <w:r>
+        <w:rPr>
+          <w:lang w:eastAsia="ru-RU"/>
+        </w:rPr>
+        <w:t>100 см</w:t>
+      </w:r>
+      <w:r>
+        <w:rPr>
+          <w:lang w:eastAsia="ru-RU"/>
+        </w:rPr>
+        <w:t>.</w:t>
+      </w:r>
+    </w:p>
+    <w:p>
+      <w:pPr>
+        <w:ind w:firstLine="0"/>
+        <w:rPr>
+          <w:lang w:eastAsia="ru-RU"/>
+        </w:rPr>
+      </w:pPr>
+      <w:r>
+        <w:rPr>
+          <w:lang w:eastAsia="ru-RU"/>
+        </w:rPr>
+        <w:tab/>
+        <w:t xml:space="preserve">В ходе тестирования </w:t>
+      </w:r>
+      <w:r>
+        <w:rPr>
+          <w:lang w:eastAsia="ru-RU"/>
+        </w:rPr>
+        <w:t xml:space="preserve">готового проекта были проведены тесты движения без нагрузки на ровной поверхности, движение манипулятора без нагрузки, захват нетяжелых объектов захватным устройством. </w:t>
+      </w:r>
+      <w:proofErr w:type="spellStart"/>
+      <w:r>
+        <w:rPr>
+          <w:lang w:eastAsia="ru-RU"/>
+        </w:rPr>
+        <w:t>Робоплатформа</w:t>
+      </w:r>
+      <w:proofErr w:type="spellEnd"/>
+      <w:r>
+        <w:rPr>
+          <w:lang w:eastAsia="ru-RU"/>
+        </w:rPr>
+        <w:t xml:space="preserve"> </w:t>
+      </w:r>
+      <w:proofErr w:type="spellStart"/>
+      <w:r>
+        <w:rPr>
+          <w:lang w:eastAsia="ru-RU"/>
+        </w:rPr>
+        <w:t>продемонстировала</w:t>
+      </w:r>
+      <w:proofErr w:type="spellEnd"/>
+      <w:r>
+        <w:rPr>
+          <w:lang w:eastAsia="ru-RU"/>
+        </w:rPr>
+        <w:t xml:space="preserve"> устойчивое движение во всех направлениях, плавное движение манипулятора, захватное устройство стабильно удерживает объект. С визуальной демонстрацией функций </w:t>
+      </w:r>
+      <w:proofErr w:type="spellStart"/>
+      <w:r>
+        <w:rPr>
+          <w:lang w:eastAsia="ru-RU"/>
+        </w:rPr>
+        <w:t>робоплатформы</w:t>
+      </w:r>
+      <w:proofErr w:type="spellEnd"/>
+      <w:r>
+        <w:rPr>
+          <w:lang w:eastAsia="ru-RU"/>
+        </w:rPr>
+        <w:t xml:space="preserve"> можно ознакомиться по ссылке</w:t>
+      </w:r>
+      <w:r>
+        <w:rPr>
+          <w:lang w:eastAsia="ru-RU"/>
+        </w:rPr>
+        <w:t>:</w:t>
+      </w:r>
+      <w:r>
+        <w:rPr>
+          <w:lang w:eastAsia="ru-RU"/>
+        </w:rPr>
+        <w:t xml:space="preserve"> «».</w:t>
+      </w:r>
+    </w:p>
+    <w:p>
+      <w:pPr>
+        <w:ind w:firstLine="0"/>
+        <w:rPr>
+          <w:lang w:eastAsia="ru-RU"/>
+        </w:rPr>
+      </w:pPr>
+    </w:p>
+    <w:p>
+      <w:pPr>
+        <w:pStyle w:val="2"/>
+        <w:jc w:val="left"/>
+        <w:rPr>
+          <w:lang w:eastAsia="ru-RU"/>
+        </w:rPr>
+      </w:pPr>
+      <w:bookmarkStart w:id="9" w:name="_Toc223604032"/>
+      <w:r>
+        <w:rPr>
+          <w:lang w:eastAsia="ru-RU"/>
+        </w:rPr>
+        <w:t>2.2 Результаты</w:t>
+      </w:r>
+      <w:bookmarkEnd w:id="9"/>
     </w:p>
     <w:p>
       <w:pPr>
@@ -8438,7 +9669,14 @@
         <w:rPr>
           <w:lang w:eastAsia="ru-RU"/>
         </w:rPr>
-        <w:t xml:space="preserve">конструирование электронных схем, </w:t>
+        <w:t xml:space="preserve">конструирование </w:t>
+      </w:r>
+      <w:r>
+        <w:rPr>
+          <w:lang w:eastAsia="ru-RU"/>
+        </w:rPr>
+        <w:lastRenderedPageBreak/>
+        <w:t xml:space="preserve">электронных схем, </w:t>
       </w:r>
       <w:r>
         <w:rPr>
@@ -8500,248 +9738,7 @@
         <w:rPr>
           <w:lang w:eastAsia="ru-RU"/>
         </w:rPr>
-        <w:t xml:space="preserve"> имеет модульную структуру, сконструирована из доступных компонентов без встроенных изменений. Платформа </w:t>
-      </w:r>
-      <w:r>
-        <w:rPr>
-          <w:lang w:eastAsia="ru-RU"/>
-        </w:rPr>
-        <w:lastRenderedPageBreak/>
-        <w:t>имеет обширные возможности модификации, изменяющие или улучшающие существующий функционал.</w:t>
-      </w:r>
-    </w:p>
-    <w:p>
-      <w:pPr>
-        <w:ind w:firstLine="0"/>
-        <w:rPr>
-          <w:rFonts w:cs="Times New Roman"/>
-          <w:szCs w:val="28"/>
-          <w:lang w:eastAsia="ru-RU"/>
-        </w:rPr>
-      </w:pPr>
-    </w:p>
-    <w:p>
-      <w:pPr>
-        <w:ind w:firstLine="0"/>
-        <w:rPr>
-          <w:rFonts w:cs="Times New Roman"/>
-          <w:szCs w:val="28"/>
-          <w:lang w:eastAsia="ru-RU"/>
-        </w:rPr>
-      </w:pPr>
-      <w:r>
-        <w:rPr>
-          <w:rFonts w:cs="Times New Roman"/>
-          <w:szCs w:val="28"/>
-          <w:lang w:eastAsia="ru-RU"/>
-        </w:rPr>
-        <w:t>Список источников</w:t>
-      </w:r>
-    </w:p>
-    <w:p>
-      <w:pPr>
-        <w:rPr>
-          <w:szCs w:val="28"/>
-          <w:lang w:eastAsia="ru-RU"/>
-        </w:rPr>
-      </w:pPr>
-      <w:r>
-        <w:rPr>
-          <w:rFonts w:cs="Times New Roman"/>
-          <w:szCs w:val="28"/>
-          <w:lang w:eastAsia="ru-RU"/>
-        </w:rPr>
-        <w:t>Официальная документация</w:t>
-      </w:r>
-      <w:r>
-        <w:rPr>
-          <w:rFonts w:cs="Times New Roman"/>
-          <w:szCs w:val="28"/>
-          <w:lang w:eastAsia="ru-RU"/>
-        </w:rPr>
-        <w:t xml:space="preserve"> </w:t>
-      </w:r>
-      <w:r>
-        <w:rPr>
-          <w:rFonts w:cs="Times New Roman"/>
-          <w:szCs w:val="28"/>
-          <w:lang w:eastAsia="ru-RU"/>
-        </w:rPr>
-        <w:t xml:space="preserve">микроконтроллера ATmega328P, </w:t>
-      </w:r>
-      <w:r>
-        <w:rPr>
-          <w:rFonts w:cs="Times New Roman"/>
-          <w:szCs w:val="28"/>
-          <w:lang w:eastAsia="ru-RU"/>
-        </w:rPr>
-        <w:t xml:space="preserve">платы разработки </w:t>
-      </w:r>
-      <w:r>
-        <w:rPr>
-          <w:rFonts w:cs="Times New Roman"/>
-          <w:szCs w:val="28"/>
-          <w:lang w:val="en-US" w:eastAsia="ru-RU"/>
-        </w:rPr>
-        <w:t>Iskra</w:t>
-      </w:r>
-      <w:r>
-        <w:rPr>
-          <w:rFonts w:cs="Times New Roman"/>
-          <w:szCs w:val="28"/>
-          <w:lang w:eastAsia="ru-RU"/>
-        </w:rPr>
-        <w:t xml:space="preserve"> </w:t>
-      </w:r>
-      <w:r>
-        <w:rPr>
-          <w:rFonts w:cs="Times New Roman"/>
-          <w:szCs w:val="28"/>
-          <w:lang w:val="en-US" w:eastAsia="ru-RU"/>
-        </w:rPr>
-        <w:t>Uno</w:t>
-      </w:r>
-      <w:r>
-        <w:rPr>
-          <w:rFonts w:cs="Times New Roman"/>
-          <w:szCs w:val="28"/>
-          <w:lang w:eastAsia="ru-RU"/>
-        </w:rPr>
-        <w:t xml:space="preserve">, </w:t>
-      </w:r>
-      <w:r>
-        <w:rPr>
-          <w:rFonts w:cs="Times New Roman"/>
-          <w:szCs w:val="28"/>
-          <w:lang w:eastAsia="ru-RU"/>
-        </w:rPr>
-        <w:t xml:space="preserve">модуля </w:t>
-      </w:r>
-      <w:r>
-        <w:rPr>
-          <w:szCs w:val="28"/>
-          <w:lang w:eastAsia="ru-RU"/>
-        </w:rPr>
-        <w:t>nRF24L01</w:t>
-      </w:r>
-      <w:r>
-        <w:rPr>
-          <w:rFonts w:cs="Times New Roman"/>
-          <w:szCs w:val="28"/>
-          <w:lang w:eastAsia="ru-RU"/>
-        </w:rPr>
-        <w:t>.</w:t>
-      </w:r>
-    </w:p>
-    <w:p>
-      <w:pPr>
-        <w:rPr>
-          <w:szCs w:val="28"/>
-          <w:lang w:eastAsia="ru-RU"/>
-        </w:rPr>
-      </w:pPr>
-      <w:r>
-        <w:rPr>
-          <w:rFonts w:cs="Times New Roman"/>
-          <w:szCs w:val="28"/>
-          <w:lang w:eastAsia="ru-RU"/>
-        </w:rPr>
-        <w:t xml:space="preserve">Документация библиотек </w:t>
-      </w:r>
-      <w:proofErr w:type="spellStart"/>
-      <w:r>
-        <w:rPr>
-          <w:szCs w:val="28"/>
-          <w:lang w:eastAsia="ru-RU"/>
-        </w:rPr>
-        <w:t>ServoSmooth</w:t>
-      </w:r>
-      <w:proofErr w:type="spellEnd"/>
-      <w:r>
-        <w:rPr>
-          <w:szCs w:val="28"/>
-          <w:lang w:eastAsia="ru-RU"/>
-        </w:rPr>
-        <w:t xml:space="preserve">, RF24, </w:t>
-      </w:r>
-      <w:proofErr w:type="spellStart"/>
-      <w:r>
-        <w:rPr>
-          <w:szCs w:val="28"/>
-          <w:lang w:eastAsia="ru-RU"/>
-        </w:rPr>
-        <w:t>NewPing</w:t>
-      </w:r>
-      <w:proofErr w:type="spellEnd"/>
-      <w:r>
-        <w:rPr>
-          <w:szCs w:val="28"/>
-          <w:lang w:eastAsia="ru-RU"/>
-        </w:rPr>
-        <w:t xml:space="preserve"> и </w:t>
-      </w:r>
-      <w:proofErr w:type="spellStart"/>
-      <w:r>
-        <w:rPr>
-          <w:szCs w:val="28"/>
-          <w:lang w:eastAsia="ru-RU"/>
-        </w:rPr>
-        <w:t>EncButton</w:t>
-      </w:r>
-      <w:proofErr w:type="spellEnd"/>
-    </w:p>
-    <w:p>
-      <w:pPr>
-        <w:rPr>
-          <w:szCs w:val="28"/>
-          <w:lang w:eastAsia="ru-RU"/>
-        </w:rPr>
-      </w:pPr>
-      <w:r>
-        <w:rPr>
-          <w:szCs w:val="28"/>
-          <w:lang w:eastAsia="ru-RU"/>
-        </w:rPr>
-        <w:t xml:space="preserve">Популярные российские и зарубежные образовательные ресурсы - </w:t>
-      </w:r>
-      <w:r>
-        <w:rPr>
-          <w:szCs w:val="28"/>
-          <w:lang w:eastAsia="ru-RU"/>
-        </w:rPr>
-        <w:t>amperka.ru, alexgyver.ru</w:t>
-      </w:r>
-      <w:r>
-        <w:rPr>
-          <w:szCs w:val="28"/>
-          <w:lang w:eastAsia="ru-RU"/>
-        </w:rPr>
-        <w:t>, docs.arduino.cc, evolvector.ru</w:t>
-      </w:r>
-    </w:p>
-    <w:p>
-      <w:pPr>
-        <w:rPr>
-          <w:lang w:eastAsia="ru-RU"/>
-        </w:rPr>
-      </w:pPr>
-      <w:r>
-        <w:rPr>
-          <w:lang w:eastAsia="ru-RU"/>
-        </w:rPr>
-        <w:t>С</w:t>
-      </w:r>
-      <w:r>
-        <w:rPr>
-          <w:lang w:eastAsia="ru-RU"/>
-        </w:rPr>
-        <w:t>татьи и инструкции по сборке мобильных роботов с манипуляторами 2023–2025 годов</w:t>
-      </w:r>
-      <w:r>
-        <w:rPr>
-          <w:lang w:eastAsia="ru-RU"/>
-        </w:rPr>
-        <w:t>.</w:t>
+        <w:t xml:space="preserve"> имеет модульную структуру, сконструирована из доступных компонентов без встроенных изменений. Платформа имеет обширные возможности модификации, изменяющие или улучшающие существующий функционал.</w:t>
       </w:r>
     </w:p>
     <w:p>
@@ -8749,10 +9746,701 @@
         <w:spacing w:after="160" w:line="259" w:lineRule="auto"/>
         <w:ind w:firstLine="0"/>
         <w:jc w:val="left"/>
-      </w:pPr>
+        <w:rPr>
+          <w:rFonts w:cs="Times New Roman"/>
+          <w:szCs w:val="28"/>
+          <w:lang w:eastAsia="ru-RU"/>
+        </w:rPr>
+      </w:pPr>
+      <w:r>
+        <w:rPr>
+          <w:rFonts w:cs="Times New Roman"/>
+          <w:szCs w:val="28"/>
+          <w:lang w:eastAsia="ru-RU"/>
+        </w:rPr>
+        <w:br w:type="page"/>
+      </w:r>
+    </w:p>
+    <w:p>
+      <w:pPr>
+        <w:pStyle w:val="1"/>
+        <w:ind w:firstLine="0"/>
+        <w:jc w:val="center"/>
+      </w:pPr>
+      <w:bookmarkStart w:id="10" w:name="_Toc223604033"/>
+      <w:r>
+        <w:lastRenderedPageBreak/>
+        <w:t>ЗАКЛЮЧЕНИЕ</w:t>
+      </w:r>
+      <w:bookmarkEnd w:id="10"/>
+    </w:p>
+    <w:p>
+      <w:pPr>
+        <w:rPr>
+          <w:lang w:eastAsia="ru-RU"/>
+        </w:rPr>
+      </w:pPr>
+      <w:r>
+        <w:rPr>
+          <w:lang w:eastAsia="ru-RU"/>
+        </w:rPr>
+        <w:t xml:space="preserve">В результате выполнения проекта была достигнута поставленная цель: разработан и изготовлен действующий образец мобильной </w:t>
+      </w:r>
+      <w:proofErr w:type="spellStart"/>
+      <w:r>
+        <w:rPr>
+          <w:lang w:eastAsia="ru-RU"/>
+        </w:rPr>
+        <w:t>робоплатформы</w:t>
+      </w:r>
+      <w:proofErr w:type="spellEnd"/>
+      <w:r>
+        <w:rPr>
+          <w:lang w:eastAsia="ru-RU"/>
+        </w:rPr>
+        <w:t xml:space="preserve"> с манипулятором и оригинальной системой дистанционного управления на базе двух плат </w:t>
+      </w:r>
+      <w:proofErr w:type="spellStart"/>
+      <w:r>
+        <w:rPr>
+          <w:lang w:eastAsia="ru-RU"/>
+        </w:rPr>
+        <w:t>Iskra</w:t>
+      </w:r>
+      <w:proofErr w:type="spellEnd"/>
+      <w:r>
+        <w:rPr>
+          <w:lang w:eastAsia="ru-RU"/>
+        </w:rPr>
+        <w:t xml:space="preserve"> </w:t>
+      </w:r>
+      <w:proofErr w:type="spellStart"/>
+      <w:r>
+        <w:rPr>
+          <w:lang w:eastAsia="ru-RU"/>
+        </w:rPr>
+        <w:t>Uno</w:t>
+      </w:r>
+      <w:proofErr w:type="spellEnd"/>
+      <w:r>
+        <w:rPr>
+          <w:lang w:eastAsia="ru-RU"/>
+        </w:rPr>
+        <w:t>, модулей nRF24L01 и сервоприводов PDI-6225MG-300.</w:t>
+      </w:r>
+    </w:p>
+    <w:p>
+      <w:pPr>
+        <w:rPr>
+          <w:rFonts w:cs="Times New Roman"/>
+          <w:szCs w:val="28"/>
+          <w:lang w:eastAsia="ru-RU"/>
+        </w:rPr>
+      </w:pPr>
+      <w:r>
+        <w:rPr>
+          <w:rFonts w:cs="Times New Roman"/>
+          <w:szCs w:val="28"/>
+          <w:lang w:eastAsia="ru-RU"/>
+        </w:rPr>
+        <w:t>Помимо технического результата, работа над проектом позволила получить важные навыки: понимание принципов построения комплексных робототехнических систем, работу с беспроводной связью, шиной I²C, программированием микроконтроллеров и сервоприводами. Также были развиты навыки командной работы, творческого решения возникающих проблем и оформления технической документации.</w:t>
+      </w:r>
+    </w:p>
+    <w:p>
+      <w:pPr>
+        <w:rPr>
+          <w:rFonts w:cs="Times New Roman"/>
+          <w:szCs w:val="28"/>
+          <w:lang w:eastAsia="ru-RU"/>
+        </w:rPr>
+      </w:pPr>
+      <w:r>
+        <w:rPr>
+          <w:rFonts w:cs="Times New Roman"/>
+          <w:szCs w:val="28"/>
+          <w:lang w:eastAsia="ru-RU"/>
+        </w:rPr>
+        <w:t>Проект показал реальную возможность применения современных технологий в образовательных целях и открыл перспективы для дальнейшего совершенствования робота (добавление камеры, голосового управления, датчиков линии).</w:t>
+      </w:r>
+    </w:p>
+    <w:p>
+      <w:pPr>
+        <w:spacing w:after="160" w:line="259" w:lineRule="auto"/>
+        <w:ind w:firstLine="0"/>
+        <w:jc w:val="left"/>
+        <w:rPr>
+          <w:rFonts w:cs="Times New Roman"/>
+          <w:szCs w:val="28"/>
+          <w:lang w:eastAsia="ru-RU"/>
+        </w:rPr>
+      </w:pPr>
+      <w:r>
+        <w:rPr>
+          <w:rFonts w:cs="Times New Roman"/>
+          <w:szCs w:val="28"/>
+          <w:lang w:eastAsia="ru-RU"/>
+        </w:rPr>
+        <w:br w:type="page"/>
+      </w:r>
+    </w:p>
+    <w:p>
+      <w:pPr>
+        <w:pStyle w:val="1"/>
+        <w:ind w:firstLine="0"/>
+        <w:jc w:val="center"/>
+      </w:pPr>
+      <w:bookmarkStart w:id="11" w:name="_Toc223604034"/>
+      <w:r>
+        <w:lastRenderedPageBreak/>
+        <w:t>С</w:t>
+      </w:r>
+      <w:r>
+        <w:t>ПИСОК ЛИТЕРАТУРЫ</w:t>
+      </w:r>
+      <w:bookmarkEnd w:id="11"/>
+    </w:p>
+    <w:p>
+      <w:pPr>
+        <w:pStyle w:val="a5"/>
+        <w:numPr>
+          <w:ilvl w:val="0"/>
+          <w:numId w:val="19"/>
+        </w:numPr>
+        <w:ind w:left="0" w:firstLine="709"/>
+        <w:rPr>
+          <w:lang w:eastAsia="ru-RU"/>
+        </w:rPr>
+      </w:pPr>
+      <w:r>
+        <w:rPr>
+          <w:lang w:eastAsia="ru-RU"/>
+        </w:rPr>
+        <w:t xml:space="preserve">Блум Дж. Изучаем </w:t>
+      </w:r>
+      <w:proofErr w:type="spellStart"/>
+      <w:proofErr w:type="gramStart"/>
+      <w:r>
+        <w:rPr>
+          <w:lang w:eastAsia="ru-RU"/>
+        </w:rPr>
+        <w:t>Arduino</w:t>
+      </w:r>
+      <w:proofErr w:type="spellEnd"/>
+      <w:r>
+        <w:rPr>
+          <w:lang w:eastAsia="ru-RU"/>
+        </w:rPr>
+        <w:t xml:space="preserve"> :</w:t>
+      </w:r>
+      <w:proofErr w:type="gramEnd"/>
+      <w:r>
+        <w:rPr>
+          <w:lang w:eastAsia="ru-RU"/>
+        </w:rPr>
+        <w:t xml:space="preserve"> инструменты и методы технического </w:t>
+      </w:r>
+      <w:proofErr w:type="gramStart"/>
+      <w:r>
+        <w:rPr>
+          <w:lang w:eastAsia="ru-RU"/>
+        </w:rPr>
+        <w:t>волшебства :</w:t>
+      </w:r>
+      <w:proofErr w:type="gramEnd"/>
+      <w:r>
+        <w:rPr>
+          <w:lang w:eastAsia="ru-RU"/>
+        </w:rPr>
+        <w:t xml:space="preserve"> пер. с англ. – СПб</w:t>
+      </w:r>
+      <w:proofErr w:type="gramStart"/>
+      <w:r>
+        <w:rPr>
+          <w:lang w:eastAsia="ru-RU"/>
+        </w:rPr>
+        <w:t>. :</w:t>
+      </w:r>
+      <w:proofErr w:type="gramEnd"/>
+      <w:r>
+        <w:rPr>
+          <w:lang w:eastAsia="ru-RU"/>
+        </w:rPr>
+        <w:t xml:space="preserve"> БХВ-Петербург, 2015. – 336 с. </w:t>
+      </w:r>
+    </w:p>
+    <w:p>
+      <w:pPr>
+        <w:pStyle w:val="a5"/>
+        <w:numPr>
+          <w:ilvl w:val="0"/>
+          <w:numId w:val="19"/>
+        </w:numPr>
+        <w:ind w:left="0" w:firstLine="709"/>
+        <w:rPr>
+          <w:lang w:eastAsia="ru-RU"/>
+        </w:rPr>
+      </w:pPr>
+      <w:r>
+        <w:rPr>
+          <w:lang w:eastAsia="ru-RU"/>
+        </w:rPr>
+        <w:t xml:space="preserve">Момот М. В. Мобильные роботы на базе </w:t>
+      </w:r>
+      <w:proofErr w:type="spellStart"/>
+      <w:r>
+        <w:rPr>
+          <w:lang w:eastAsia="ru-RU"/>
+        </w:rPr>
+        <w:t>Arduino</w:t>
+      </w:r>
+      <w:proofErr w:type="spellEnd"/>
+      <w:r>
+        <w:rPr>
+          <w:lang w:eastAsia="ru-RU"/>
+        </w:rPr>
+        <w:t>. – 3-е изд. – СПб</w:t>
+      </w:r>
+      <w:proofErr w:type="gramStart"/>
+      <w:r>
+        <w:rPr>
+          <w:lang w:eastAsia="ru-RU"/>
+        </w:rPr>
+        <w:t>. :</w:t>
+      </w:r>
+      <w:proofErr w:type="gramEnd"/>
+      <w:r>
+        <w:rPr>
+          <w:lang w:eastAsia="ru-RU"/>
+        </w:rPr>
+        <w:t xml:space="preserve"> БХВ-Петербург, 2023. – 336 с. </w:t>
+      </w:r>
+    </w:p>
+    <w:p>
+      <w:pPr>
+        <w:pStyle w:val="a5"/>
+        <w:numPr>
+          <w:ilvl w:val="0"/>
+          <w:numId w:val="19"/>
+        </w:numPr>
+        <w:ind w:left="0" w:firstLine="709"/>
+        <w:rPr>
+          <w:lang w:val="en-US" w:eastAsia="ru-RU"/>
+        </w:rPr>
+      </w:pPr>
+      <w:r>
+        <w:rPr>
+          <w:lang w:val="en-US" w:eastAsia="ru-RU"/>
+        </w:rPr>
+        <w:t>ATmega328P. 8-bit AVR Microcontroller with 32K Bytes In-System Programmable Flash : Datasheet [</w:t>
+      </w:r>
+      <w:r>
+        <w:rPr>
+          <w:lang w:eastAsia="ru-RU"/>
+        </w:rPr>
+        <w:t>Электронный</w:t>
+      </w:r>
+      <w:r>
+        <w:rPr>
+          <w:lang w:val="en-US" w:eastAsia="ru-RU"/>
+        </w:rPr>
+        <w:t xml:space="preserve"> </w:t>
+      </w:r>
+      <w:r>
+        <w:rPr>
+          <w:lang w:eastAsia="ru-RU"/>
+        </w:rPr>
+        <w:t>ресурс</w:t>
+      </w:r>
+      <w:r>
+        <w:rPr>
+          <w:lang w:val="en-US" w:eastAsia="ru-RU"/>
+        </w:rPr>
+        <w:t xml:space="preserve">] / Microchip Technology Inc. – URL: </w:t>
+      </w:r>
+      <w:hyperlink r:id="rId22" w:tgtFrame="_blank" w:history="1">
+        <w:r>
+          <w:rPr>
+            <w:rStyle w:val="ab"/>
+            <w:lang w:val="en-US" w:eastAsia="ru-RU"/>
+          </w:rPr>
+          <w:t>https://ww1.microchip.com/downloads/en/DeviceDoc/Atmel-7810-Automotive-Microcontrollers-ATmega328P_Datasheet.pdf</w:t>
+        </w:r>
+      </w:hyperlink>
+      <w:r>
+        <w:rPr>
+          <w:lang w:val="en-US" w:eastAsia="ru-RU"/>
+        </w:rPr>
+        <w:t xml:space="preserve"> (</w:t>
+      </w:r>
+      <w:r>
+        <w:rPr>
+          <w:lang w:eastAsia="ru-RU"/>
+        </w:rPr>
+        <w:t>дата</w:t>
+      </w:r>
+      <w:r>
+        <w:rPr>
+          <w:lang w:val="en-US" w:eastAsia="ru-RU"/>
+        </w:rPr>
+        <w:t xml:space="preserve"> </w:t>
+      </w:r>
+      <w:r>
+        <w:rPr>
+          <w:lang w:eastAsia="ru-RU"/>
+        </w:rPr>
+        <w:t>обращения</w:t>
+      </w:r>
+      <w:r>
+        <w:rPr>
+          <w:lang w:val="en-US" w:eastAsia="ru-RU"/>
+        </w:rPr>
+        <w:t xml:space="preserve">: 05.03.2026). </w:t>
+      </w:r>
+    </w:p>
+    <w:p>
+      <w:pPr>
+        <w:pStyle w:val="a5"/>
+        <w:numPr>
+          <w:ilvl w:val="0"/>
+          <w:numId w:val="19"/>
+        </w:numPr>
+        <w:ind w:left="0" w:firstLine="709"/>
+        <w:rPr>
+          <w:lang w:val="en-US" w:eastAsia="ru-RU"/>
+        </w:rPr>
+      </w:pPr>
+      <w:r>
+        <w:rPr>
+          <w:lang w:val="en-US" w:eastAsia="ru-RU"/>
+        </w:rPr>
+        <w:t xml:space="preserve">nRF24L01+ Single Chip 2.4 GHz </w:t>
+      </w:r>
+      <w:proofErr w:type="gramStart"/>
+      <w:r>
+        <w:rPr>
+          <w:lang w:val="en-US" w:eastAsia="ru-RU"/>
+        </w:rPr>
+        <w:t>Transceiver :</w:t>
+      </w:r>
+      <w:proofErr w:type="gramEnd"/>
+      <w:r>
+        <w:rPr>
+          <w:lang w:val="en-US" w:eastAsia="ru-RU"/>
+        </w:rPr>
+        <w:t xml:space="preserve"> Product Specification [</w:t>
+      </w:r>
+      <w:r>
+        <w:rPr>
+          <w:lang w:eastAsia="ru-RU"/>
+        </w:rPr>
+        <w:t>Электронный</w:t>
+      </w:r>
+      <w:r>
+        <w:rPr>
+          <w:lang w:val="en-US" w:eastAsia="ru-RU"/>
+        </w:rPr>
+        <w:t xml:space="preserve"> </w:t>
+      </w:r>
+      <w:r>
+        <w:rPr>
+          <w:lang w:eastAsia="ru-RU"/>
+        </w:rPr>
+        <w:t>ресурс</w:t>
+      </w:r>
+      <w:r>
+        <w:rPr>
+          <w:lang w:val="en-US" w:eastAsia="ru-RU"/>
+        </w:rPr>
+        <w:t xml:space="preserve">] / Nordic Semiconductor. – URL: </w:t>
+      </w:r>
+      <w:hyperlink r:id="rId23" w:tgtFrame="_blank" w:history="1">
+        <w:r>
+          <w:rPr>
+            <w:rStyle w:val="ab"/>
+            <w:lang w:val="en-US" w:eastAsia="ru-RU"/>
+          </w:rPr>
+          <w:t>https://www.nordicsemi.com/-/media/Software-and-other-downloads/Product-Specifications/nRF24L01_Product_Specification_v1_0.pdf</w:t>
+        </w:r>
+      </w:hyperlink>
+      <w:r>
+        <w:rPr>
+          <w:lang w:val="en-US" w:eastAsia="ru-RU"/>
+        </w:rPr>
+        <w:t xml:space="preserve"> (</w:t>
+      </w:r>
+      <w:r>
+        <w:rPr>
+          <w:lang w:eastAsia="ru-RU"/>
+        </w:rPr>
+        <w:t>дата</w:t>
+      </w:r>
+      <w:r>
+        <w:rPr>
+          <w:lang w:val="en-US" w:eastAsia="ru-RU"/>
+        </w:rPr>
+        <w:t xml:space="preserve"> </w:t>
+      </w:r>
+      <w:r>
+        <w:rPr>
+          <w:lang w:eastAsia="ru-RU"/>
+        </w:rPr>
+        <w:t>обращения</w:t>
+      </w:r>
+      <w:r>
+        <w:rPr>
+          <w:lang w:val="en-US" w:eastAsia="ru-RU"/>
+        </w:rPr>
+        <w:t xml:space="preserve">: 05.03.2026). </w:t>
+      </w:r>
+    </w:p>
+    <w:p>
+      <w:pPr>
+        <w:pStyle w:val="a5"/>
+        <w:numPr>
+          <w:ilvl w:val="0"/>
+          <w:numId w:val="19"/>
+        </w:numPr>
+        <w:ind w:left="0" w:firstLine="709"/>
+        <w:rPr>
+          <w:lang w:eastAsia="ru-RU"/>
+        </w:rPr>
+      </w:pPr>
+      <w:r>
+        <w:rPr>
+          <w:lang w:eastAsia="ru-RU"/>
+        </w:rPr>
+        <w:t xml:space="preserve">Искра </w:t>
+      </w:r>
+      <w:proofErr w:type="spellStart"/>
+      <w:proofErr w:type="gramStart"/>
+      <w:r>
+        <w:rPr>
+          <w:lang w:eastAsia="ru-RU"/>
+        </w:rPr>
+        <w:t>Uno</w:t>
+      </w:r>
+      <w:proofErr w:type="spellEnd"/>
+      <w:r>
+        <w:rPr>
+          <w:lang w:eastAsia="ru-RU"/>
+        </w:rPr>
+        <w:t xml:space="preserve"> :</w:t>
+      </w:r>
+      <w:proofErr w:type="gramEnd"/>
+      <w:r>
+        <w:rPr>
+          <w:lang w:eastAsia="ru-RU"/>
+        </w:rPr>
+        <w:t xml:space="preserve"> документация [Электронный ресурс] // </w:t>
+      </w:r>
+      <w:proofErr w:type="spellStart"/>
+      <w:proofErr w:type="gramStart"/>
+      <w:r>
+        <w:rPr>
+          <w:lang w:eastAsia="ru-RU"/>
+        </w:rPr>
+        <w:t>Амперка</w:t>
+      </w:r>
+      <w:proofErr w:type="spellEnd"/>
+      <w:r>
+        <w:rPr>
+          <w:lang w:eastAsia="ru-RU"/>
+        </w:rPr>
+        <w:t xml:space="preserve"> :</w:t>
+      </w:r>
+      <w:proofErr w:type="gramEnd"/>
+      <w:r>
+        <w:rPr>
+          <w:lang w:eastAsia="ru-RU"/>
+        </w:rPr>
+        <w:t xml:space="preserve"> вики. – URL: </w:t>
+      </w:r>
+      <w:hyperlink r:id="rId24" w:tgtFrame="_blank" w:history="1">
+        <w:r>
+          <w:rPr>
+            <w:rStyle w:val="ab"/>
+            <w:lang w:eastAsia="ru-RU"/>
+          </w:rPr>
+          <w:t>https://wiki.amperka.ru/products:iskra-uno</w:t>
+        </w:r>
+      </w:hyperlink>
+      <w:r>
+        <w:rPr>
+          <w:lang w:eastAsia="ru-RU"/>
+        </w:rPr>
+        <w:t xml:space="preserve"> (дата обращения: 05.03.2026). </w:t>
+      </w:r>
+    </w:p>
+    <w:p>
+      <w:pPr>
+        <w:pStyle w:val="a5"/>
+        <w:numPr>
+          <w:ilvl w:val="0"/>
+          <w:numId w:val="19"/>
+        </w:numPr>
+        <w:ind w:left="0" w:firstLine="709"/>
+        <w:rPr>
+          <w:lang w:eastAsia="ru-RU"/>
+        </w:rPr>
+      </w:pPr>
+      <w:r>
+        <w:rPr>
+          <w:lang w:eastAsia="ru-RU"/>
+        </w:rPr>
+        <w:t xml:space="preserve">Уроки </w:t>
+      </w:r>
+      <w:proofErr w:type="spellStart"/>
+      <w:r>
+        <w:rPr>
+          <w:lang w:eastAsia="ru-RU"/>
+        </w:rPr>
+        <w:t>Arduino</w:t>
+      </w:r>
+      <w:proofErr w:type="spellEnd"/>
+      <w:r>
+        <w:rPr>
+          <w:lang w:eastAsia="ru-RU"/>
+        </w:rPr>
+        <w:t xml:space="preserve"> [Электронный ресурс] / Алекс </w:t>
+      </w:r>
+      <w:proofErr w:type="spellStart"/>
+      <w:r>
+        <w:rPr>
+          <w:lang w:eastAsia="ru-RU"/>
+        </w:rPr>
+        <w:t>Гайвер</w:t>
+      </w:r>
+      <w:proofErr w:type="spellEnd"/>
+      <w:r>
+        <w:rPr>
+          <w:lang w:eastAsia="ru-RU"/>
+        </w:rPr>
+        <w:t xml:space="preserve">. – URL: </w:t>
+      </w:r>
+      <w:hyperlink r:id="rId25" w:tgtFrame="_blank" w:history="1">
+        <w:r>
+          <w:rPr>
+            <w:rStyle w:val="ab"/>
+            <w:lang w:eastAsia="ru-RU"/>
+          </w:rPr>
+          <w:t>https://alexgyver.ru/lessons/</w:t>
+        </w:r>
+      </w:hyperlink>
+      <w:r>
+        <w:rPr>
+          <w:lang w:eastAsia="ru-RU"/>
+        </w:rPr>
+        <w:t xml:space="preserve"> (дата обращения: 05.03.2026). </w:t>
+      </w:r>
+    </w:p>
+    <w:p>
+      <w:pPr>
+        <w:pStyle w:val="a5"/>
+        <w:numPr>
+          <w:ilvl w:val="0"/>
+          <w:numId w:val="19"/>
+        </w:numPr>
+        <w:ind w:left="0" w:firstLine="709"/>
+        <w:rPr>
+          <w:lang w:eastAsia="ru-RU"/>
+        </w:rPr>
+      </w:pPr>
+      <w:proofErr w:type="spellStart"/>
+      <w:r>
+        <w:rPr>
+          <w:lang w:eastAsia="ru-RU"/>
+        </w:rPr>
+        <w:t>Arduino</w:t>
+      </w:r>
+      <w:proofErr w:type="spellEnd"/>
+      <w:r>
+        <w:rPr>
+          <w:lang w:eastAsia="ru-RU"/>
+        </w:rPr>
+        <w:t xml:space="preserve"> </w:t>
+      </w:r>
+      <w:proofErr w:type="spellStart"/>
+      <w:r>
+        <w:rPr>
+          <w:lang w:eastAsia="ru-RU"/>
+        </w:rPr>
+        <w:t>Documentation</w:t>
+      </w:r>
+      <w:proofErr w:type="spellEnd"/>
+      <w:r>
+        <w:rPr>
+          <w:lang w:eastAsia="ru-RU"/>
+        </w:rPr>
+        <w:t xml:space="preserve"> [Электронный ресурс]. – URL: </w:t>
+      </w:r>
+      <w:hyperlink r:id="rId26" w:tgtFrame="_blank" w:history="1">
+        <w:r>
+          <w:rPr>
+            <w:rStyle w:val="ab"/>
+            <w:lang w:eastAsia="ru-RU"/>
+          </w:rPr>
+          <w:t>https://docs.arduino.cc</w:t>
+        </w:r>
+      </w:hyperlink>
+      <w:r>
+        <w:rPr>
+          <w:lang w:eastAsia="ru-RU"/>
+        </w:rPr>
+        <w:t xml:space="preserve"> (дата обращения: 05.03.2026). </w:t>
+      </w:r>
+    </w:p>
+    <w:p>
+      <w:pPr>
+        <w:pStyle w:val="a5"/>
+        <w:numPr>
+          <w:ilvl w:val="0"/>
+          <w:numId w:val="19"/>
+        </w:numPr>
+        <w:ind w:left="0" w:firstLine="709"/>
+        <w:rPr>
+          <w:lang w:eastAsia="ru-RU"/>
+        </w:rPr>
+      </w:pPr>
+      <w:proofErr w:type="spellStart"/>
+      <w:proofErr w:type="gramStart"/>
+      <w:r>
+        <w:rPr>
+          <w:lang w:eastAsia="ru-RU"/>
+        </w:rPr>
+        <w:t>Evolvector</w:t>
+      </w:r>
+      <w:proofErr w:type="spellEnd"/>
+      <w:r>
+        <w:rPr>
+          <w:lang w:eastAsia="ru-RU"/>
+        </w:rPr>
+        <w:t xml:space="preserve"> :</w:t>
+      </w:r>
+      <w:proofErr w:type="gramEnd"/>
+      <w:r>
+        <w:rPr>
+          <w:lang w:eastAsia="ru-RU"/>
+        </w:rPr>
+        <w:t xml:space="preserve"> образовательный портал [Электронный ресурс]. – URL: </w:t>
+      </w:r>
+      <w:hyperlink r:id="rId27" w:tgtFrame="_blank" w:history="1">
+        <w:r>
+          <w:rPr>
+            <w:rStyle w:val="ab"/>
+            <w:lang w:eastAsia="ru-RU"/>
+          </w:rPr>
+          <w:t>https://evolvector.ru</w:t>
+        </w:r>
+      </w:hyperlink>
+      <w:r>
+        <w:rPr>
+          <w:lang w:eastAsia="ru-RU"/>
+        </w:rPr>
+        <w:t xml:space="preserve"> (дата обращения: 05.03.2026).</w:t>
+      </w:r>
     </w:p>
     <w:sectPr>
-      <w:headerReference w:type="default" r:id="rId22"/>
+      <w:headerReference w:type="default" r:id="rId28"/>
       <w:pgSz w:w="11906" w:h="16838"/>
       <w:pgMar w:top="1134" w:right="850" w:bottom="1134" w:left="1701" w:header="708" w:footer="708" w:gutter="0"/>
       <w:cols w:space="708"/>
@@ -9173,6 +10861,119 @@
     </w:lvl>
   </w:abstractNum>
   <w:abstractNum w:abstractNumId="2" w15:restartNumberingAfterBreak="0">
+    <w:nsid w:val="17AC52E6"/>
+    <w:multiLevelType w:val="hybridMultilevel"/>
+    <w:tmpl w:val="899A5A0C"/>
+    <w:lvl w:ilvl="0" w:tplc="04190001">
+      <w:start w:val="1"/>
+      <w:numFmt w:val="bullet"/>
+      <w:lvlText w:val=""/>
+      <w:lvlJc w:val="left"/>
+      <w:pPr>
+        <w:ind w:left="1874" w:hanging="456"/>
+      </w:pPr>
+      <w:rPr>
+        <w:rFonts w:ascii="Symbol" w:hAnsi="Symbol" w:hint="default"/>
+      </w:rPr>
+    </w:lvl>
+    <w:lvl w:ilvl="1" w:tplc="FFFFFFFF" w:tentative="1">
+      <w:start w:val="1"/>
+      <w:numFmt w:val="bullet"/>
+      <w:lvlText w:val="o"/>
+      <w:lvlJc w:val="left"/>
+      <w:pPr>
+        <w:ind w:left="2149" w:hanging="360"/>
+      </w:pPr>
+      <w:rPr>
+        <w:rFonts w:ascii="Courier New" w:hAnsi="Courier New" w:cs="Courier New" w:hint="default"/>
+      </w:rPr>
+    </w:lvl>
+    <w:lvl w:ilvl="2" w:tplc="FFFFFFFF" w:tentative="1">
+      <w:start w:val="1"/>
+      <w:numFmt w:val="bullet"/>
+      <w:lvlText w:val=""/>
+      <w:lvlJc w:val="left"/>
+      <w:pPr>
+        <w:ind w:left="2869" w:hanging="360"/>
+      </w:pPr>
+      <w:rPr>
+        <w:rFonts w:ascii="Wingdings" w:hAnsi="Wingdings" w:hint="default"/>
+      </w:rPr>
+    </w:lvl>
+    <w:lvl w:ilvl="3" w:tplc="FFFFFFFF" w:tentative="1">
+      <w:start w:val="1"/>
+      <w:numFmt w:val="bullet"/>
+      <w:lvlText w:val=""/>
+      <w:lvlJc w:val="left"/>
+      <w:pPr>
+        <w:ind w:left="3589" w:hanging="360"/>
+      </w:pPr>
+      <w:rPr>
+        <w:rFonts w:ascii="Symbol" w:hAnsi="Symbol" w:hint="default"/>
+      </w:rPr>
+    </w:lvl>
+    <w:lvl w:ilvl="4" w:tplc="FFFFFFFF" w:tentative="1">
+      <w:start w:val="1"/>
+      <w:numFmt w:val="bullet"/>
+      <w:lvlText w:val="o"/>
+      <w:lvlJc w:val="left"/>
+      <w:pPr>
+        <w:ind w:left="4309" w:hanging="360"/>
+      </w:pPr>
+      <w:rPr>
+        <w:rFonts w:ascii="Courier New" w:hAnsi="Courier New" w:cs="Courier New" w:hint="default"/>
+      </w:rPr>
+    </w:lvl>
+    <w:lvl w:ilvl="5" w:tplc="FFFFFFFF" w:tentative="1">
+      <w:start w:val="1"/>
+      <w:numFmt w:val="bullet"/>
+      <w:lvlText w:val=""/>
+      <w:lvlJc w:val="left"/>
+      <w:pPr>
+        <w:ind w:left="5029" w:hanging="360"/>
+      </w:pPr>
+      <w:rPr>
+        <w:rFonts w:ascii="Wingdings" w:hAnsi="Wingdings" w:hint="default"/>
+      </w:rPr>
+    </w:lvl>
+    <w:lvl w:ilvl="6" w:tplc="FFFFFFFF" w:tentative="1">
+      <w:start w:val="1"/>
+      <w:numFmt w:val="bullet"/>
+      <w:lvlText w:val=""/>
+      <w:lvlJc w:val="left"/>
+      <w:pPr>
+        <w:ind w:left="5749" w:hanging="360"/>
+      </w:pPr>
+      <w:rPr>
+        <w:rFonts w:ascii="Symbol" w:hAnsi="Symbol" w:hint="default"/>
+      </w:rPr>
+    </w:lvl>
+    <w:lvl w:ilvl="7" w:tplc="FFFFFFFF" w:tentative="1">
+      <w:start w:val="1"/>
+      <w:numFmt w:val="bullet"/>
+      <w:lvlText w:val="o"/>
+      <w:lvlJc w:val="left"/>
+      <w:pPr>
+        <w:ind w:left="6469" w:hanging="360"/>
+      </w:pPr>
+      <w:rPr>
+        <w:rFonts w:ascii="Courier New" w:hAnsi="Courier New" w:cs="Courier New" w:hint="default"/>
+      </w:rPr>
+    </w:lvl>
+    <w:lvl w:ilvl="8" w:tplc="FFFFFFFF" w:tentative="1">
+      <w:start w:val="1"/>
+      <w:numFmt w:val="bullet"/>
+      <w:lvlText w:val=""/>
+      <w:lvlJc w:val="left"/>
+      <w:pPr>
+        <w:ind w:left="7189" w:hanging="360"/>
+      </w:pPr>
+      <w:rPr>
+        <w:rFonts w:ascii="Wingdings" w:hAnsi="Wingdings" w:hint="default"/>
+      </w:rPr>
+    </w:lvl>
+  </w:abstractNum>
+  <w:abstractNum w:abstractNumId="3" w15:restartNumberingAfterBreak="0">
     <w:nsid w:val="25CB1E8B"/>
     <w:multiLevelType w:val="multilevel"/>
     <w:tmpl w:val="FF0C088C"/>
@@ -9321,7 +11122,120 @@
       </w:rPr>
     </w:lvl>
   </w:abstractNum>
-  <w:abstractNum w:abstractNumId="3" w15:restartNumberingAfterBreak="0">
+  <w:abstractNum w:abstractNumId="4" w15:restartNumberingAfterBreak="0">
+    <w:nsid w:val="2DD50D68"/>
+    <w:multiLevelType w:val="hybridMultilevel"/>
+    <w:tmpl w:val="BE0ECBD8"/>
+    <w:lvl w:ilvl="0" w:tplc="0419000F">
+      <w:start w:val="1"/>
+      <w:numFmt w:val="decimal"/>
+      <w:lvlText w:val="%1."/>
+      <w:lvlJc w:val="left"/>
+      <w:pPr>
+        <w:ind w:left="1874" w:hanging="456"/>
+      </w:pPr>
+      <w:rPr>
+        <w:rFonts w:hint="default"/>
+      </w:rPr>
+    </w:lvl>
+    <w:lvl w:ilvl="1" w:tplc="FFFFFFFF" w:tentative="1">
+      <w:start w:val="1"/>
+      <w:numFmt w:val="bullet"/>
+      <w:lvlText w:val="o"/>
+      <w:lvlJc w:val="left"/>
+      <w:pPr>
+        <w:ind w:left="2149" w:hanging="360"/>
+      </w:pPr>
+      <w:rPr>
+        <w:rFonts w:ascii="Courier New" w:hAnsi="Courier New" w:cs="Courier New" w:hint="default"/>
+      </w:rPr>
+    </w:lvl>
+    <w:lvl w:ilvl="2" w:tplc="FFFFFFFF" w:tentative="1">
+      <w:start w:val="1"/>
+      <w:numFmt w:val="bullet"/>
+      <w:lvlText w:val=""/>
+      <w:lvlJc w:val="left"/>
+      <w:pPr>
+        <w:ind w:left="2869" w:hanging="360"/>
+      </w:pPr>
+      <w:rPr>
+        <w:rFonts w:ascii="Wingdings" w:hAnsi="Wingdings" w:hint="default"/>
+      </w:rPr>
+    </w:lvl>
+    <w:lvl w:ilvl="3" w:tplc="FFFFFFFF" w:tentative="1">
+      <w:start w:val="1"/>
+      <w:numFmt w:val="bullet"/>
+      <w:lvlText w:val=""/>
+      <w:lvlJc w:val="left"/>
+      <w:pPr>
+        <w:ind w:left="3589" w:hanging="360"/>
+      </w:pPr>
+      <w:rPr>
+        <w:rFonts w:ascii="Symbol" w:hAnsi="Symbol" w:hint="default"/>
+      </w:rPr>
+    </w:lvl>
+    <w:lvl w:ilvl="4" w:tplc="FFFFFFFF" w:tentative="1">
+      <w:start w:val="1"/>
+      <w:numFmt w:val="bullet"/>
+      <w:lvlText w:val="o"/>
+      <w:lvlJc w:val="left"/>
+      <w:pPr>
+        <w:ind w:left="4309" w:hanging="360"/>
+      </w:pPr>
+      <w:rPr>
+        <w:rFonts w:ascii="Courier New" w:hAnsi="Courier New" w:cs="Courier New" w:hint="default"/>
+      </w:rPr>
+    </w:lvl>
+    <w:lvl w:ilvl="5" w:tplc="FFFFFFFF" w:tentative="1">
+      <w:start w:val="1"/>
+      <w:numFmt w:val="bullet"/>
+      <w:lvlText w:val=""/>
+      <w:lvlJc w:val="left"/>
+      <w:pPr>
+        <w:ind w:left="5029" w:hanging="360"/>
+      </w:pPr>
+      <w:rPr>
+        <w:rFonts w:ascii="Wingdings" w:hAnsi="Wingdings" w:hint="default"/>
+      </w:rPr>
+    </w:lvl>
+    <w:lvl w:ilvl="6" w:tplc="FFFFFFFF" w:tentative="1">
+      <w:start w:val="1"/>
+      <w:numFmt w:val="bullet"/>
+      <w:lvlText w:val=""/>
+      <w:lvlJc w:val="left"/>
+      <w:pPr>
+        <w:ind w:left="5749" w:hanging="360"/>
+      </w:pPr>
+      <w:rPr>
+        <w:rFonts w:ascii="Symbol" w:hAnsi="Symbol" w:hint="default"/>
+      </w:rPr>
+    </w:lvl>
+    <w:lvl w:ilvl="7" w:tplc="FFFFFFFF" w:tentative="1">
+      <w:start w:val="1"/>
+      <w:numFmt w:val="bullet"/>
+      <w:lvlText w:val="o"/>
+      <w:lvlJc w:val="left"/>
+      <w:pPr>
+        <w:ind w:left="6469" w:hanging="360"/>
+      </w:pPr>
+      <w:rPr>
+        <w:rFonts w:ascii="Courier New" w:hAnsi="Courier New" w:cs="Courier New" w:hint="default"/>
+      </w:rPr>
+    </w:lvl>
+    <w:lvl w:ilvl="8" w:tplc="FFFFFFFF" w:tentative="1">
+      <w:start w:val="1"/>
+      <w:numFmt w:val="bullet"/>
+      <w:lvlText w:val=""/>
+      <w:lvlJc w:val="left"/>
+      <w:pPr>
+        <w:ind w:left="7189" w:hanging="360"/>
+      </w:pPr>
+      <w:rPr>
+        <w:rFonts w:ascii="Wingdings" w:hAnsi="Wingdings" w:hint="default"/>
+      </w:rPr>
+    </w:lvl>
+  </w:abstractNum>
+  <w:abstractNum w:abstractNumId="5" w15:restartNumberingAfterBreak="0">
     <w:nsid w:val="2ECA4662"/>
     <w:multiLevelType w:val="hybridMultilevel"/>
     <w:tmpl w:val="F7A401F2"/>
@@ -9410,7 +11324,344 @@
       </w:pPr>
     </w:lvl>
   </w:abstractNum>
-  <w:abstractNum w:abstractNumId="4" w15:restartNumberingAfterBreak="0">
+  <w:abstractNum w:abstractNumId="6" w15:restartNumberingAfterBreak="0">
+    <w:nsid w:val="35F52E17"/>
+    <w:multiLevelType w:val="hybridMultilevel"/>
+    <w:tmpl w:val="D2EC53C0"/>
+    <w:lvl w:ilvl="0" w:tplc="98A6846E">
+      <w:numFmt w:val="bullet"/>
+      <w:lvlText w:val=""/>
+      <w:lvlJc w:val="left"/>
+      <w:pPr>
+        <w:ind w:left="1874" w:hanging="456"/>
+      </w:pPr>
+      <w:rPr>
+        <w:rFonts w:ascii="Times New Roman" w:eastAsiaTheme="minorHAnsi" w:hAnsi="Times New Roman" w:cs="Times New Roman" w:hint="default"/>
+      </w:rPr>
+    </w:lvl>
+    <w:lvl w:ilvl="1" w:tplc="04190003" w:tentative="1">
+      <w:start w:val="1"/>
+      <w:numFmt w:val="bullet"/>
+      <w:lvlText w:val="o"/>
+      <w:lvlJc w:val="left"/>
+      <w:pPr>
+        <w:ind w:left="2149" w:hanging="360"/>
+      </w:pPr>
+      <w:rPr>
+        <w:rFonts w:ascii="Courier New" w:hAnsi="Courier New" w:cs="Courier New" w:hint="default"/>
+      </w:rPr>
+    </w:lvl>
+    <w:lvl w:ilvl="2" w:tplc="04190005" w:tentative="1">
+      <w:start w:val="1"/>
+      <w:numFmt w:val="bullet"/>
+      <w:lvlText w:val=""/>
+      <w:lvlJc w:val="left"/>
+      <w:pPr>
+        <w:ind w:left="2869" w:hanging="360"/>
+      </w:pPr>
+      <w:rPr>
+        <w:rFonts w:ascii="Wingdings" w:hAnsi="Wingdings" w:hint="default"/>
+      </w:rPr>
+    </w:lvl>
+    <w:lvl w:ilvl="3" w:tplc="04190001" w:tentative="1">
+      <w:start w:val="1"/>
+      <w:numFmt w:val="bullet"/>
+      <w:lvlText w:val=""/>
+      <w:lvlJc w:val="left"/>
+      <w:pPr>
+        <w:ind w:left="3589" w:hanging="360"/>
+      </w:pPr>
+      <w:rPr>
+        <w:rFonts w:ascii="Symbol" w:hAnsi="Symbol" w:hint="default"/>
+      </w:rPr>
+    </w:lvl>
+    <w:lvl w:ilvl="4" w:tplc="04190003" w:tentative="1">
+      <w:start w:val="1"/>
+      <w:numFmt w:val="bullet"/>
+      <w:lvlText w:val="o"/>
+      <w:lvlJc w:val="left"/>
+      <w:pPr>
+        <w:ind w:left="4309" w:hanging="360"/>
+      </w:pPr>
+      <w:rPr>
+        <w:rFonts w:ascii="Courier New" w:hAnsi="Courier New" w:cs="Courier New" w:hint="default"/>
+      </w:rPr>
+    </w:lvl>
+    <w:lvl w:ilvl="5" w:tplc="04190005" w:tentative="1">
+      <w:start w:val="1"/>
+      <w:numFmt w:val="bullet"/>
+      <w:lvlText w:val=""/>
+      <w:lvlJc w:val="left"/>
+      <w:pPr>
+        <w:ind w:left="5029" w:hanging="360"/>
+      </w:pPr>
+      <w:rPr>
+        <w:rFonts w:ascii="Wingdings" w:hAnsi="Wingdings" w:hint="default"/>
+      </w:rPr>
+    </w:lvl>
+    <w:lvl w:ilvl="6" w:tplc="04190001" w:tentative="1">
+      <w:start w:val="1"/>
+      <w:numFmt w:val="bullet"/>
+      <w:lvlText w:val=""/>
+      <w:lvlJc w:val="left"/>
+      <w:pPr>
+        <w:ind w:left="5749" w:hanging="360"/>
+      </w:pPr>
+      <w:rPr>
+        <w:rFonts w:ascii="Symbol" w:hAnsi="Symbol" w:hint="default"/>
+      </w:rPr>
+    </w:lvl>
+    <w:lvl w:ilvl="7" w:tplc="04190003" w:tentative="1">
+      <w:start w:val="1"/>
+      <w:numFmt w:val="bullet"/>
+      <w:lvlText w:val="o"/>
+      <w:lvlJc w:val="left"/>
+      <w:pPr>
+        <w:ind w:left="6469" w:hanging="360"/>
+      </w:pPr>
+      <w:rPr>
+        <w:rFonts w:ascii="Courier New" w:hAnsi="Courier New" w:cs="Courier New" w:hint="default"/>
+      </w:rPr>
+    </w:lvl>
+    <w:lvl w:ilvl="8" w:tplc="04190005" w:tentative="1">
+      <w:start w:val="1"/>
+      <w:numFmt w:val="bullet"/>
+      <w:lvlText w:val=""/>
+      <w:lvlJc w:val="left"/>
+      <w:pPr>
+        <w:ind w:left="7189" w:hanging="360"/>
+      </w:pPr>
+      <w:rPr>
+        <w:rFonts w:ascii="Wingdings" w:hAnsi="Wingdings" w:hint="default"/>
+      </w:rPr>
+    </w:lvl>
+  </w:abstractNum>
+  <w:abstractNum w:abstractNumId="7" w15:restartNumberingAfterBreak="0">
+    <w:nsid w:val="3B9207A3"/>
+    <w:multiLevelType w:val="hybridMultilevel"/>
+    <w:tmpl w:val="3116962C"/>
+    <w:lvl w:ilvl="0" w:tplc="98A6846E">
+      <w:numFmt w:val="bullet"/>
+      <w:lvlText w:val=""/>
+      <w:lvlJc w:val="left"/>
+      <w:pPr>
+        <w:ind w:left="1874" w:hanging="456"/>
+      </w:pPr>
+      <w:rPr>
+        <w:rFonts w:ascii="Times New Roman" w:eastAsiaTheme="minorHAnsi" w:hAnsi="Times New Roman" w:cs="Times New Roman" w:hint="default"/>
+      </w:rPr>
+    </w:lvl>
+    <w:lvl w:ilvl="1" w:tplc="04190003" w:tentative="1">
+      <w:start w:val="1"/>
+      <w:numFmt w:val="bullet"/>
+      <w:lvlText w:val="o"/>
+      <w:lvlJc w:val="left"/>
+      <w:pPr>
+        <w:ind w:left="2149" w:hanging="360"/>
+      </w:pPr>
+      <w:rPr>
+        <w:rFonts w:ascii="Courier New" w:hAnsi="Courier New" w:cs="Courier New" w:hint="default"/>
+      </w:rPr>
+    </w:lvl>
+    <w:lvl w:ilvl="2" w:tplc="04190005" w:tentative="1">
+      <w:start w:val="1"/>
+      <w:numFmt w:val="bullet"/>
+      <w:lvlText w:val=""/>
+      <w:lvlJc w:val="left"/>
+      <w:pPr>
+        <w:ind w:left="2869" w:hanging="360"/>
+      </w:pPr>
+      <w:rPr>
+        <w:rFonts w:ascii="Wingdings" w:hAnsi="Wingdings" w:hint="default"/>
+      </w:rPr>
+    </w:lvl>
+    <w:lvl w:ilvl="3" w:tplc="04190001" w:tentative="1">
+      <w:start w:val="1"/>
+      <w:numFmt w:val="bullet"/>
+      <w:lvlText w:val=""/>
+      <w:lvlJc w:val="left"/>
+      <w:pPr>
+        <w:ind w:left="3589" w:hanging="360"/>
+      </w:pPr>
+      <w:rPr>
+        <w:rFonts w:ascii="Symbol" w:hAnsi="Symbol" w:hint="default"/>
+      </w:rPr>
+    </w:lvl>
+    <w:lvl w:ilvl="4" w:tplc="04190003" w:tentative="1">
+      <w:start w:val="1"/>
+      <w:numFmt w:val="bullet"/>
+      <w:lvlText w:val="o"/>
+      <w:lvlJc w:val="left"/>
+      <w:pPr>
+        <w:ind w:left="4309" w:hanging="360"/>
+      </w:pPr>
+      <w:rPr>
+        <w:rFonts w:ascii="Courier New" w:hAnsi="Courier New" w:cs="Courier New" w:hint="default"/>
+      </w:rPr>
+    </w:lvl>
+    <w:lvl w:ilvl="5" w:tplc="04190005" w:tentative="1">
+      <w:start w:val="1"/>
+      <w:numFmt w:val="bullet"/>
+      <w:lvlText w:val=""/>
+      <w:lvlJc w:val="left"/>
+      <w:pPr>
+        <w:ind w:left="5029" w:hanging="360"/>
+      </w:pPr>
+      <w:rPr>
+        <w:rFonts w:ascii="Wingdings" w:hAnsi="Wingdings" w:hint="default"/>
+      </w:rPr>
+    </w:lvl>
+    <w:lvl w:ilvl="6" w:tplc="04190001" w:tentative="1">
+      <w:start w:val="1"/>
+      <w:numFmt w:val="bullet"/>
+      <w:lvlText w:val=""/>
+      <w:lvlJc w:val="left"/>
+      <w:pPr>
+        <w:ind w:left="5749" w:hanging="360"/>
+      </w:pPr>
+      <w:rPr>
+        <w:rFonts w:ascii="Symbol" w:hAnsi="Symbol" w:hint="default"/>
+      </w:rPr>
+    </w:lvl>
+    <w:lvl w:ilvl="7" w:tplc="04190003" w:tentative="1">
+      <w:start w:val="1"/>
+      <w:numFmt w:val="bullet"/>
+      <w:lvlText w:val="o"/>
+      <w:lvlJc w:val="left"/>
+      <w:pPr>
+        <w:ind w:left="6469" w:hanging="360"/>
+      </w:pPr>
+      <w:rPr>
+        <w:rFonts w:ascii="Courier New" w:hAnsi="Courier New" w:cs="Courier New" w:hint="default"/>
+      </w:rPr>
+    </w:lvl>
+    <w:lvl w:ilvl="8" w:tplc="04190005" w:tentative="1">
+      <w:start w:val="1"/>
+      <w:numFmt w:val="bullet"/>
+      <w:lvlText w:val=""/>
+      <w:lvlJc w:val="left"/>
+      <w:pPr>
+        <w:ind w:left="7189" w:hanging="360"/>
+      </w:pPr>
+      <w:rPr>
+        <w:rFonts w:ascii="Wingdings" w:hAnsi="Wingdings" w:hint="default"/>
+      </w:rPr>
+    </w:lvl>
+  </w:abstractNum>
+  <w:abstractNum w:abstractNumId="8" w15:restartNumberingAfterBreak="0">
+    <w:nsid w:val="3D0D57B8"/>
+    <w:multiLevelType w:val="hybridMultilevel"/>
+    <w:tmpl w:val="E4121070"/>
+    <w:lvl w:ilvl="0" w:tplc="04190001">
+      <w:start w:val="1"/>
+      <w:numFmt w:val="bullet"/>
+      <w:lvlText w:val=""/>
+      <w:lvlJc w:val="left"/>
+      <w:pPr>
+        <w:ind w:left="1429" w:hanging="360"/>
+      </w:pPr>
+      <w:rPr>
+        <w:rFonts w:ascii="Symbol" w:hAnsi="Symbol" w:hint="default"/>
+      </w:rPr>
+    </w:lvl>
+    <w:lvl w:ilvl="1" w:tplc="04190003" w:tentative="1">
+      <w:start w:val="1"/>
+      <w:numFmt w:val="bullet"/>
+      <w:lvlText w:val="o"/>
+      <w:lvlJc w:val="left"/>
+      <w:pPr>
+        <w:ind w:left="2149" w:hanging="360"/>
+      </w:pPr>
+      <w:rPr>
+        <w:rFonts w:ascii="Courier New" w:hAnsi="Courier New" w:cs="Courier New" w:hint="default"/>
+      </w:rPr>
+    </w:lvl>
+    <w:lvl w:ilvl="2" w:tplc="04190005" w:tentative="1">
+      <w:start w:val="1"/>
+      <w:numFmt w:val="bullet"/>
+      <w:lvlText w:val=""/>
+      <w:lvlJc w:val="left"/>
+      <w:pPr>
+        <w:ind w:left="2869" w:hanging="360"/>
+      </w:pPr>
+      <w:rPr>
+        <w:rFonts w:ascii="Wingdings" w:hAnsi="Wingdings" w:hint="default"/>
+      </w:rPr>
+    </w:lvl>
+    <w:lvl w:ilvl="3" w:tplc="04190001" w:tentative="1">
+      <w:start w:val="1"/>
+      <w:numFmt w:val="bullet"/>
+      <w:lvlText w:val=""/>
+      <w:lvlJc w:val="left"/>
+      <w:pPr>
+        <w:ind w:left="3589" w:hanging="360"/>
+      </w:pPr>
+      <w:rPr>
+        <w:rFonts w:ascii="Symbol" w:hAnsi="Symbol" w:hint="default"/>
+      </w:rPr>
+    </w:lvl>
+    <w:lvl w:ilvl="4" w:tplc="04190003" w:tentative="1">
+      <w:start w:val="1"/>
+      <w:numFmt w:val="bullet"/>
+      <w:lvlText w:val="o"/>
+      <w:lvlJc w:val="left"/>
+      <w:pPr>
+        <w:ind w:left="4309" w:hanging="360"/>
+      </w:pPr>
+      <w:rPr>
+        <w:rFonts w:ascii="Courier New" w:hAnsi="Courier New" w:cs="Courier New" w:hint="default"/>
+      </w:rPr>
+    </w:lvl>
+    <w:lvl w:ilvl="5" w:tplc="04190005" w:tentative="1">
+      <w:start w:val="1"/>
+      <w:numFmt w:val="bullet"/>
+      <w:lvlText w:val=""/>
+      <w:lvlJc w:val="left"/>
+      <w:pPr>
+        <w:ind w:left="5029" w:hanging="360"/>
+      </w:pPr>
+      <w:rPr>
+        <w:rFonts w:ascii="Wingdings" w:hAnsi="Wingdings" w:hint="default"/>
+      </w:rPr>
+    </w:lvl>
+    <w:lvl w:ilvl="6" w:tplc="04190001" w:tentative="1">
+      <w:start w:val="1"/>
+      <w:numFmt w:val="bullet"/>
+      <w:lvlText w:val=""/>
+      <w:lvlJc w:val="left"/>
+      <w:pPr>
+        <w:ind w:left="5749" w:hanging="360"/>
+      </w:pPr>
+      <w:rPr>
+        <w:rFonts w:ascii="Symbol" w:hAnsi="Symbol" w:hint="default"/>
+      </w:rPr>
+    </w:lvl>
+    <w:lvl w:ilvl="7" w:tplc="04190003" w:tentative="1">
+      <w:start w:val="1"/>
+      <w:numFmt w:val="bullet"/>
+      <w:lvlText w:val="o"/>
+      <w:lvlJc w:val="left"/>
+      <w:pPr>
+        <w:ind w:left="6469" w:hanging="360"/>
+      </w:pPr>
+      <w:rPr>
+        <w:rFonts w:ascii="Courier New" w:hAnsi="Courier New" w:cs="Courier New" w:hint="default"/>
+      </w:rPr>
+    </w:lvl>
+    <w:lvl w:ilvl="8" w:tplc="04190005" w:tentative="1">
+      <w:start w:val="1"/>
+      <w:numFmt w:val="bullet"/>
+      <w:lvlText w:val=""/>
+      <w:lvlJc w:val="left"/>
+      <w:pPr>
+        <w:ind w:left="7189" w:hanging="360"/>
+      </w:pPr>
+      <w:rPr>
+        <w:rFonts w:ascii="Wingdings" w:hAnsi="Wingdings" w:hint="default"/>
+      </w:rPr>
+    </w:lvl>
+  </w:abstractNum>
+  <w:abstractNum w:abstractNumId="9" w15:restartNumberingAfterBreak="0">
     <w:nsid w:val="4491309F"/>
     <w:multiLevelType w:val="multilevel"/>
     <w:tmpl w:val="1C1E2444"/>
@@ -9523,7 +11774,119 @@
       </w:rPr>
     </w:lvl>
   </w:abstractNum>
-  <w:abstractNum w:abstractNumId="5" w15:restartNumberingAfterBreak="0">
+  <w:abstractNum w:abstractNumId="10" w15:restartNumberingAfterBreak="0">
+    <w:nsid w:val="49144162"/>
+    <w:multiLevelType w:val="hybridMultilevel"/>
+    <w:tmpl w:val="17F2EB84"/>
+    <w:lvl w:ilvl="0" w:tplc="98A6846E">
+      <w:numFmt w:val="bullet"/>
+      <w:lvlText w:val=""/>
+      <w:lvlJc w:val="left"/>
+      <w:pPr>
+        <w:ind w:left="1165" w:hanging="456"/>
+      </w:pPr>
+      <w:rPr>
+        <w:rFonts w:ascii="Times New Roman" w:eastAsiaTheme="minorHAnsi" w:hAnsi="Times New Roman" w:cs="Times New Roman" w:hint="default"/>
+      </w:rPr>
+    </w:lvl>
+    <w:lvl w:ilvl="1" w:tplc="04190003" w:tentative="1">
+      <w:start w:val="1"/>
+      <w:numFmt w:val="bullet"/>
+      <w:lvlText w:val="o"/>
+      <w:lvlJc w:val="left"/>
+      <w:pPr>
+        <w:ind w:left="1789" w:hanging="360"/>
+      </w:pPr>
+      <w:rPr>
+        <w:rFonts w:ascii="Courier New" w:hAnsi="Courier New" w:cs="Courier New" w:hint="default"/>
+      </w:rPr>
+    </w:lvl>
+    <w:lvl w:ilvl="2" w:tplc="04190005" w:tentative="1">
+      <w:start w:val="1"/>
+      <w:numFmt w:val="bullet"/>
+      <w:lvlText w:val=""/>
+      <w:lvlJc w:val="left"/>
+      <w:pPr>
+        <w:ind w:left="2509" w:hanging="360"/>
+      </w:pPr>
+      <w:rPr>
+        <w:rFonts w:ascii="Wingdings" w:hAnsi="Wingdings" w:hint="default"/>
+      </w:rPr>
+    </w:lvl>
+    <w:lvl w:ilvl="3" w:tplc="04190001" w:tentative="1">
+      <w:start w:val="1"/>
+      <w:numFmt w:val="bullet"/>
+      <w:lvlText w:val=""/>
+      <w:lvlJc w:val="left"/>
+      <w:pPr>
+        <w:ind w:left="3229" w:hanging="360"/>
+      </w:pPr>
+      <w:rPr>
+        <w:rFonts w:ascii="Symbol" w:hAnsi="Symbol" w:hint="default"/>
+      </w:rPr>
+    </w:lvl>
+    <w:lvl w:ilvl="4" w:tplc="04190003" w:tentative="1">
+      <w:start w:val="1"/>
+      <w:numFmt w:val="bullet"/>
+      <w:lvlText w:val="o"/>
+      <w:lvlJc w:val="left"/>
+      <w:pPr>
+        <w:ind w:left="3949" w:hanging="360"/>
+      </w:pPr>
+      <w:rPr>
+        <w:rFonts w:ascii="Courier New" w:hAnsi="Courier New" w:cs="Courier New" w:hint="default"/>
+      </w:rPr>
+    </w:lvl>
+    <w:lvl w:ilvl="5" w:tplc="04190005" w:tentative="1">
+      <w:start w:val="1"/>
+      <w:numFmt w:val="bullet"/>
+      <w:lvlText w:val=""/>
+      <w:lvlJc w:val="left"/>
+      <w:pPr>
+        <w:ind w:left="4669" w:hanging="360"/>
+      </w:pPr>
+      <w:rPr>
+        <w:rFonts w:ascii="Wingdings" w:hAnsi="Wingdings" w:hint="default"/>
+      </w:rPr>
+    </w:lvl>
+    <w:lvl w:ilvl="6" w:tplc="04190001" w:tentative="1">
+      <w:start w:val="1"/>
+      <w:numFmt w:val="bullet"/>
+      <w:lvlText w:val=""/>
+      <w:lvlJc w:val="left"/>
+      <w:pPr>
+        <w:ind w:left="5389" w:hanging="360"/>
+      </w:pPr>
+      <w:rPr>
+        <w:rFonts w:ascii="Symbol" w:hAnsi="Symbol" w:hint="default"/>
+      </w:rPr>
+    </w:lvl>
+    <w:lvl w:ilvl="7" w:tplc="04190003" w:tentative="1">
+      <w:start w:val="1"/>
+      <w:numFmt w:val="bullet"/>
+      <w:lvlText w:val="o"/>
+      <w:lvlJc w:val="left"/>
+      <w:pPr>
+        <w:ind w:left="6109" w:hanging="360"/>
+      </w:pPr>
+      <w:rPr>
+        <w:rFonts w:ascii="Courier New" w:hAnsi="Courier New" w:cs="Courier New" w:hint="default"/>
+      </w:rPr>
+    </w:lvl>
+    <w:lvl w:ilvl="8" w:tplc="04190005" w:tentative="1">
+      <w:start w:val="1"/>
+      <w:numFmt w:val="bullet"/>
+      <w:lvlText w:val=""/>
+      <w:lvlJc w:val="left"/>
+      <w:pPr>
+        <w:ind w:left="6829" w:hanging="360"/>
+      </w:pPr>
+      <w:rPr>
+        <w:rFonts w:ascii="Wingdings" w:hAnsi="Wingdings" w:hint="default"/>
+      </w:rPr>
+    </w:lvl>
+  </w:abstractNum>
+  <w:abstractNum w:abstractNumId="11" w15:restartNumberingAfterBreak="0">
     <w:nsid w:val="4CF80ED2"/>
     <w:multiLevelType w:val="multilevel"/>
     <w:tmpl w:val="8064F72E"/>
@@ -9672,7 +12035,7 @@
       </w:rPr>
     </w:lvl>
   </w:abstractNum>
-  <w:abstractNum w:abstractNumId="6" w15:restartNumberingAfterBreak="0">
+  <w:abstractNum w:abstractNumId="12" w15:restartNumberingAfterBreak="0">
     <w:nsid w:val="5134773F"/>
     <w:multiLevelType w:val="multilevel"/>
     <w:tmpl w:val="D9D0B3A2"/>
@@ -9821,7 +12184,119 @@
       </w:rPr>
     </w:lvl>
   </w:abstractNum>
-  <w:abstractNum w:abstractNumId="7" w15:restartNumberingAfterBreak="0">
+  <w:abstractNum w:abstractNumId="13" w15:restartNumberingAfterBreak="0">
+    <w:nsid w:val="57FB0A86"/>
+    <w:multiLevelType w:val="hybridMultilevel"/>
+    <w:tmpl w:val="DDF6ADB6"/>
+    <w:lvl w:ilvl="0" w:tplc="98A6846E">
+      <w:numFmt w:val="bullet"/>
+      <w:lvlText w:val=""/>
+      <w:lvlJc w:val="left"/>
+      <w:pPr>
+        <w:ind w:left="1874" w:hanging="456"/>
+      </w:pPr>
+      <w:rPr>
+        <w:rFonts w:ascii="Times New Roman" w:eastAsiaTheme="minorHAnsi" w:hAnsi="Times New Roman" w:cs="Times New Roman" w:hint="default"/>
+      </w:rPr>
+    </w:lvl>
+    <w:lvl w:ilvl="1" w:tplc="04190003" w:tentative="1">
+      <w:start w:val="1"/>
+      <w:numFmt w:val="bullet"/>
+      <w:lvlText w:val="o"/>
+      <w:lvlJc w:val="left"/>
+      <w:pPr>
+        <w:ind w:left="2149" w:hanging="360"/>
+      </w:pPr>
+      <w:rPr>
+        <w:rFonts w:ascii="Courier New" w:hAnsi="Courier New" w:cs="Courier New" w:hint="default"/>
+      </w:rPr>
+    </w:lvl>
+    <w:lvl w:ilvl="2" w:tplc="04190005" w:tentative="1">
+      <w:start w:val="1"/>
+      <w:numFmt w:val="bullet"/>
+      <w:lvlText w:val=""/>
+      <w:lvlJc w:val="left"/>
+      <w:pPr>
+        <w:ind w:left="2869" w:hanging="360"/>
+      </w:pPr>
+      <w:rPr>
+        <w:rFonts w:ascii="Wingdings" w:hAnsi="Wingdings" w:hint="default"/>
+      </w:rPr>
+    </w:lvl>
+    <w:lvl w:ilvl="3" w:tplc="04190001" w:tentative="1">
+      <w:start w:val="1"/>
+      <w:numFmt w:val="bullet"/>
+      <w:lvlText w:val=""/>
+      <w:lvlJc w:val="left"/>
+      <w:pPr>
+        <w:ind w:left="3589" w:hanging="360"/>
+      </w:pPr>
+      <w:rPr>
+        <w:rFonts w:ascii="Symbol" w:hAnsi="Symbol" w:hint="default"/>
+      </w:rPr>
+    </w:lvl>
+    <w:lvl w:ilvl="4" w:tplc="04190003" w:tentative="1">
+      <w:start w:val="1"/>
+      <w:numFmt w:val="bullet"/>
+      <w:lvlText w:val="o"/>
+      <w:lvlJc w:val="left"/>
+      <w:pPr>
+        <w:ind w:left="4309" w:hanging="360"/>
+      </w:pPr>
+      <w:rPr>
+        <w:rFonts w:ascii="Courier New" w:hAnsi="Courier New" w:cs="Courier New" w:hint="default"/>
+      </w:rPr>
+    </w:lvl>
+    <w:lvl w:ilvl="5" w:tplc="04190005" w:tentative="1">
+      <w:start w:val="1"/>
+      <w:numFmt w:val="bullet"/>
+      <w:lvlText w:val=""/>
+      <w:lvlJc w:val="left"/>
+      <w:pPr>
+        <w:ind w:left="5029" w:hanging="360"/>
+      </w:pPr>
+      <w:rPr>
+        <w:rFonts w:ascii="Wingdings" w:hAnsi="Wingdings" w:hint="default"/>
+      </w:rPr>
+    </w:lvl>
+    <w:lvl w:ilvl="6" w:tplc="04190001" w:tentative="1">
+      <w:start w:val="1"/>
+      <w:numFmt w:val="bullet"/>
+      <w:lvlText w:val=""/>
+      <w:lvlJc w:val="left"/>
+      <w:pPr>
+        <w:ind w:left="5749" w:hanging="360"/>
+      </w:pPr>
+      <w:rPr>
+        <w:rFonts w:ascii="Symbol" w:hAnsi="Symbol" w:hint="default"/>
+      </w:rPr>
+    </w:lvl>
+    <w:lvl w:ilvl="7" w:tplc="04190003" w:tentative="1">
+      <w:start w:val="1"/>
+      <w:numFmt w:val="bullet"/>
+      <w:lvlText w:val="o"/>
+      <w:lvlJc w:val="left"/>
+      <w:pPr>
+        <w:ind w:left="6469" w:hanging="360"/>
+      </w:pPr>
+      <w:rPr>
+        <w:rFonts w:ascii="Courier New" w:hAnsi="Courier New" w:cs="Courier New" w:hint="default"/>
+      </w:rPr>
+    </w:lvl>
+    <w:lvl w:ilvl="8" w:tplc="04190005" w:tentative="1">
+      <w:start w:val="1"/>
+      <w:numFmt w:val="bullet"/>
+      <w:lvlText w:val=""/>
+      <w:lvlJc w:val="left"/>
+      <w:pPr>
+        <w:ind w:left="7189" w:hanging="360"/>
+      </w:pPr>
+      <w:rPr>
+        <w:rFonts w:ascii="Wingdings" w:hAnsi="Wingdings" w:hint="default"/>
+      </w:rPr>
+    </w:lvl>
+  </w:abstractNum>
+  <w:abstractNum w:abstractNumId="14" w15:restartNumberingAfterBreak="0">
     <w:nsid w:val="59253889"/>
     <w:multiLevelType w:val="multilevel"/>
     <w:tmpl w:val="32180BEE"/>
@@ -9970,7 +12445,7 @@
       </w:rPr>
     </w:lvl>
   </w:abstractNum>
-  <w:abstractNum w:abstractNumId="8" w15:restartNumberingAfterBreak="0">
+  <w:abstractNum w:abstractNumId="15" w15:restartNumberingAfterBreak="0">
     <w:nsid w:val="5FDC3BD4"/>
     <w:multiLevelType w:val="multilevel"/>
     <w:tmpl w:val="68BA1D62"/>
@@ -10091,7 +12566,7 @@
       </w:rPr>
     </w:lvl>
   </w:abstractNum>
-  <w:abstractNum w:abstractNumId="9" w15:restartNumberingAfterBreak="0">
+  <w:abstractNum w:abstractNumId="16" w15:restartNumberingAfterBreak="0">
     <w:nsid w:val="60C23CDA"/>
     <w:multiLevelType w:val="multilevel"/>
     <w:tmpl w:val="4E5694CC"/>
@@ -10240,7 +12715,7 @@
       </w:rPr>
     </w:lvl>
   </w:abstractNum>
-  <w:abstractNum w:abstractNumId="10" w15:restartNumberingAfterBreak="0">
+  <w:abstractNum w:abstractNumId="17" w15:restartNumberingAfterBreak="0">
     <w:nsid w:val="63697597"/>
     <w:multiLevelType w:val="multilevel"/>
     <w:tmpl w:val="C32635D6"/>
@@ -10389,7 +12864,7 @@
       </w:rPr>
     </w:lvl>
   </w:abstractNum>
-  <w:abstractNum w:abstractNumId="11" w15:restartNumberingAfterBreak="0">
+  <w:abstractNum w:abstractNumId="18" w15:restartNumberingAfterBreak="0">
     <w:nsid w:val="7748683E"/>
     <w:multiLevelType w:val="multilevel"/>
     <w:tmpl w:val="E36C4356"/>
@@ -10539,39 +13014,60 @@
     </w:lvl>
   </w:abstractNum>
   <w:num w:numId="1" w16cid:durableId="117257656">
-    <w:abstractNumId w:val="8"/>
+    <w:abstractNumId w:val="15"/>
   </w:num>
   <w:num w:numId="2" w16cid:durableId="76367520">
-    <w:abstractNumId w:val="3"/>
+    <w:abstractNumId w:val="5"/>
   </w:num>
   <w:num w:numId="3" w16cid:durableId="1431124976">
-    <w:abstractNumId w:val="11"/>
+    <w:abstractNumId w:val="18"/>
   </w:num>
   <w:num w:numId="4" w16cid:durableId="166289135">
-    <w:abstractNumId w:val="7"/>
+    <w:abstractNumId w:val="14"/>
   </w:num>
   <w:num w:numId="5" w16cid:durableId="1476415853">
     <w:abstractNumId w:val="1"/>
   </w:num>
   <w:num w:numId="6" w16cid:durableId="346566757">
-    <w:abstractNumId w:val="2"/>
+    <w:abstractNumId w:val="3"/>
   </w:num>
   <w:num w:numId="7" w16cid:durableId="783619181">
-    <w:abstractNumId w:val="5"/>
+    <w:abstractNumId w:val="11"/>
   </w:num>
   <w:num w:numId="8" w16cid:durableId="1993286468">
-    <w:abstractNumId w:val="6"/>
+    <w:abstractNumId w:val="12"/>
   </w:num>
   <w:num w:numId="9" w16cid:durableId="1723480137">
-    <w:abstractNumId w:val="10"/>
+    <w:abstractNumId w:val="17"/>
   </w:num>
   <w:num w:numId="10" w16cid:durableId="1957634727">
-    <w:abstractNumId w:val="9"/>
+    <w:abstractNumId w:val="16"/>
   </w:num>
   <w:num w:numId="11" w16cid:durableId="1395393925">
     <w:abstractNumId w:val="0"/>
   </w:num>
   <w:num w:numId="12" w16cid:durableId="1310937823">
+    <w:abstractNumId w:val="9"/>
+  </w:num>
+  <w:num w:numId="13" w16cid:durableId="1603419067">
+    <w:abstractNumId w:val="8"/>
+  </w:num>
+  <w:num w:numId="14" w16cid:durableId="1921477377">
+    <w:abstractNumId w:val="10"/>
+  </w:num>
+  <w:num w:numId="15" w16cid:durableId="799688099">
+    <w:abstractNumId w:val="7"/>
+  </w:num>
+  <w:num w:numId="16" w16cid:durableId="1555386677">
+    <w:abstractNumId w:val="6"/>
+  </w:num>
+  <w:num w:numId="17" w16cid:durableId="1361783819">
+    <w:abstractNumId w:val="13"/>
+  </w:num>
+  <w:num w:numId="18" w16cid:durableId="156456463">
+    <w:abstractNumId w:val="2"/>
+  </w:num>
+  <w:num w:numId="19" w16cid:durableId="2142922494">
     <w:abstractNumId w:val="4"/>
   </w:num>
 </w:numbering>
@@ -11249,6 +13745,16 @@
       <w:shd w:val="clear" w:color="auto" w:fill="E1DFDD"/>
     </w:rPr>
   </w:style>
+  <w:style w:type="character" w:styleId="ad">
+    <w:name w:val="Placeholder Text"/>
+    <w:basedOn w:val="a0"/>
+    <w:uiPriority w:val="99"/>
+    <w:semiHidden/>
+    <w:rsid w:val="00FA2E7C"/>
+    <w:rPr>
+      <w:color w:val="666666"/>
+    </w:rPr>
+  </w:style>
 </w:styles>
 </file>
 

</xml_diff>

<commit_message>
update doc, last ver, i gess
</commit_message>
<xml_diff>
--- a/Сопроводительная записка.docx
+++ b/Сопроводительная записка.docx
@@ -215,7 +215,7 @@
           <w:szCs w:val="28"/>
           <w:lang w:eastAsia="ru-RU"/>
         </w:rPr>
-        <w:t>,</w:t>
+        <w:t xml:space="preserve"> Андреевич</w:t>
       </w:r>
       <w:r>
         <w:rPr>
@@ -223,7 +223,23 @@
           <w:szCs w:val="28"/>
           <w:lang w:eastAsia="ru-RU"/>
         </w:rPr>
+        <w:t>,</w:t>
+      </w:r>
+      <w:r>
+        <w:rPr>
+          <w:rFonts w:eastAsia="Times New Roman"/>
+          <w:szCs w:val="28"/>
+          <w:lang w:eastAsia="ru-RU"/>
+        </w:rPr>
         <w:t xml:space="preserve"> Якунин Кирилл</w:t>
+      </w:r>
+      <w:r>
+        <w:rPr>
+          <w:rFonts w:eastAsia="Times New Roman"/>
+          <w:szCs w:val="28"/>
+          <w:lang w:eastAsia="ru-RU"/>
+        </w:rPr>
+        <w:t xml:space="preserve"> Аркадьевич</w:t>
       </w:r>
     </w:p>
     <w:p>
@@ -9516,33 +9532,7 @@
         <w:rPr>
           <w:lang w:eastAsia="ru-RU"/>
         </w:rPr>
-        <w:t xml:space="preserve"> устойчивое движение во всех направлениях, плавное движение манипулятора, захватное устройство стабильно удерживает объект. С визуальной демонстрацией функций </w:t>
-      </w:r>
-      <w:proofErr w:type="spellStart"/>
-      <w:r>
-        <w:rPr>
-          <w:lang w:eastAsia="ru-RU"/>
-        </w:rPr>
-        <w:t>робоплатформы</w:t>
-      </w:r>
-      <w:proofErr w:type="spellEnd"/>
-      <w:r>
-        <w:rPr>
-          <w:lang w:eastAsia="ru-RU"/>
-        </w:rPr>
-        <w:t xml:space="preserve"> можно ознакомиться по ссылке</w:t>
-      </w:r>
-      <w:r>
-        <w:rPr>
-          <w:lang w:eastAsia="ru-RU"/>
-        </w:rPr>
-        <w:t>:</w:t>
-      </w:r>
-      <w:r>
-        <w:rPr>
-          <w:lang w:eastAsia="ru-RU"/>
-        </w:rPr>
-        <w:t xml:space="preserve"> «».</w:t>
+        <w:t xml:space="preserve"> устойчивое движение во всех направлениях, плавное движение манипулятора, захватное устройство стабильно удерживает объект. </w:t>
       </w:r>
     </w:p>
     <w:p>
@@ -9669,14 +9659,7 @@
         <w:rPr>
           <w:lang w:eastAsia="ru-RU"/>
         </w:rPr>
-        <w:t xml:space="preserve">конструирование </w:t>
-      </w:r>
-      <w:r>
-        <w:rPr>
-          <w:lang w:eastAsia="ru-RU"/>
-        </w:rPr>
-        <w:lastRenderedPageBreak/>
-        <w:t xml:space="preserve">электронных схем, </w:t>
+        <w:t xml:space="preserve">конструирование электронных схем, </w:t>
       </w:r>
       <w:r>
         <w:rPr>
@@ -9731,6 +9714,7 @@
         <w:rPr>
           <w:lang w:eastAsia="ru-RU"/>
         </w:rPr>
+        <w:lastRenderedPageBreak/>
         <w:t>Робоплатформа</w:t>
       </w:r>
       <w:proofErr w:type="spellEnd"/>

</xml_diff>